<commit_message>
Add verified EPOL 590 meeting details, Canvas site, and appointment-only office hours
</commit_message>
<xml_diff>
--- a/courses/590-fall-2026/syllabus/University-of-Illinois-Urbana-Champaign-Syllabus-590-Fall-2026-Draft.docx
+++ b/courses/590-fall-2026/syllabus/University-of-Illinois-Urbana-Champaign-Syllabus-590-Fall-2026-Draft.docx
@@ -15,7 +15,7 @@
         <w:pStyle w:val="Subtitle"/>
       </w:pPr>
       <w:r>
-        <w:t>ERAM 590 · Fall 2026 Term B · Syllabus Draft</w:t>
+        <w:t>EPOL 590 · Fall 2026 Term B · Syllabus Draft</w:t>
       </w:r>
     </w:p>
     <w:p>
@@ -203,17 +203,15 @@
             </w:pPr>
             <w:r>
               <w:rPr>
-                <w:b/>
                 <w:sz w:val="20"/>
-                <w:highlight w:val="yellow"/>
-              </w:rPr>
-              <w:t>[TO CONFIRM]</w:t>
+              </w:rPr>
+              <w:t xml:space="preserve">Mondays, 5:00–7:50 PM Central Time (America/Chicago)</w:t>
             </w:r>
             <w:r>
               <w:rPr>
                 <w:sz w:val="20"/>
               </w:rPr>
-              <w:t xml:space="preserve"> Day and time, Central Time</w:t>
+              <w:t/>
             </w:r>
           </w:p>
         </w:tc>
@@ -277,7 +275,7 @@
               <w:rPr>
                 <w:sz w:val="20"/>
               </w:rPr>
-              <w:t>Proposed: live online seminar with asynchronous reading, research, and writing</w:t>
+              <w:t xml:space="preserve">Live online seminar with asynchronous reading, research, and writing</w:t>
             </w:r>
           </w:p>
         </w:tc>
@@ -339,17 +337,15 @@
             </w:pPr>
             <w:r>
               <w:rPr>
-                <w:b/>
                 <w:sz w:val="20"/>
-                <w:highlight w:val="yellow"/>
-              </w:rPr>
-              <w:t>[TO CONFIRM]</w:t>
+              </w:rPr>
+              <w:t xml:space="preserve">Online via Zoom. [TO CONFIRM] Meeting link; access information on Canvas</w:t>
             </w:r>
             <w:r>
               <w:rPr>
                 <w:sz w:val="20"/>
               </w:rPr>
-              <w:t xml:space="preserve"> Zoom link or room; access information on Canvas</w:t>
+              <w:t/>
             </w:r>
           </w:p>
         </w:tc>
@@ -448,7 +444,7 @@
               <w:rPr>
                 <w:sz w:val="20"/>
               </w:rPr>
-              <w:t>Sections and CRNs</w:t>
+              <w:t xml:space="preserve">Section and CRN</w:t>
             </w:r>
           </w:p>
         </w:tc>
@@ -475,11 +471,9 @@
             </w:pPr>
             <w:r>
               <w:rPr>
-                <w:b/>
                 <w:sz w:val="20"/>
-                <w:highlight w:val="yellow"/>
-              </w:rPr>
-              <w:t>[TO CONFIRM]</w:t>
+              </w:rPr>
+              <w:t xml:space="preserve">Section AIL · CRN 73886 · 4 credit hours</w:t>
             </w:r>
           </w:p>
         </w:tc>
@@ -539,25 +533,26 @@
             <w:pPr>
               <w:spacing w:before="20" w:after="20" w:line="240" w:lineRule="auto"/>
             </w:pPr>
-            <w:r>
-              <w:rPr>
-                <w:sz w:val="20"/>
-              </w:rPr>
-              <w:t xml:space="preserve">Canvas — </w:t>
-            </w:r>
+            <w:hyperlink r:id="rIdCourseCanvas5902026">
+              <w:r>
+                <w:rPr>
+                  <w:sz w:val="20"/>
+                </w:rPr>
+                <w:t xml:space="preserve">https://canvas.illinois.edu/courses/75598</w:t>
+              </w:r>
+            </w:hyperlink>
             <w:r>
               <w:rPr>
                 <w:b/>
                 <w:sz w:val="20"/>
-                <w:highlight w:val="yellow"/>
-              </w:rPr>
-              <w:t>[TO CONFIRM]</w:t>
+              </w:rPr>
+              <w:t/>
             </w:r>
             <w:r>
               <w:rPr>
                 <w:sz w:val="20"/>
               </w:rPr>
-              <w:t xml:space="preserve"> insert course URL</w:t>
+              <w:t/>
             </w:r>
           </w:p>
         </w:tc>
@@ -659,20 +654,19 @@
         <w:rPr>
           <w:b/>
         </w:rPr>
-        <w:t>Office hours:</w:t>
-      </w:r>
-      <w:r>
-        <w:t xml:space="preserve"> by appointment; email me to arrange a time. </w:t>
+        <w:t xml:space="preserve">Office hours: meetings by appointment; email lmagee@illinois.edu to arrange a time.</w:t>
+      </w:r>
+      <w:r>
+        <w:t/>
       </w:r>
       <w:r>
         <w:rPr>
           <w:b/>
-          <w:highlight w:val="yellow"/>
         </w:rPr>
-        <w:t>[TO CONFIRM]</w:t>
-      </w:r>
-      <w:r>
-        <w:t xml:space="preserve"> Any regular office-hour slot.</w:t>
+        <w:t/>
+      </w:r>
+      <w:r>
+        <w:t/>
       </w:r>
     </w:p>
     <w:p>
@@ -701,12 +695,11 @@
       <w:r>
         <w:rPr>
           <w:b/>
-          <w:highlight w:val="yellow"/>
         </w:rPr>
-        <w:t>[TO CONFIRM]</w:t>
-      </w:r>
-      <w:r>
-        <w:t xml:space="preserve"> Insert the official catalog description, course designation, credit hours, and any formal prerequisites. The description above is the working course description.</w:t>
+        <w:t xml:space="preserve">[TO CONFIRM] Insert the official catalog description and any formal prerequisites. The description above is the working course description.</w:t>
+      </w:r>
+      <w:r>
+        <w:t/>
       </w:r>
     </w:p>
     <w:p>
@@ -4005,26 +3998,25 @@
     </w:p>
     <w:p>
       <w:r>
-        <w:t xml:space="preserve">The date ranges below do not assume a meeting day. If the seminar meets on Mondays, the candidate dates are </w:t>
+        <w:t xml:space="preserve">Seminars meet online on Mondays, 5:00–7:50 PM Central Time (America/Chicago): 19 October, 26 October, 2 November, 9 November, 16 November, 30 November, and 7 December 2026. There is no seminar on 23 November during fall break.</w:t>
       </w:r>
       <w:r>
         <w:rPr>
           <w:b/>
         </w:rPr>
-        <w:t>19 October, 26 October, 2 November, 9 November, 16 November, 30 November, and 7 December</w:t>
-      </w:r>
-      <w:r>
-        <w:t xml:space="preserve">. </w:t>
+        <w:t/>
+      </w:r>
+      <w:r>
+        <w:t/>
       </w:r>
       <w:r>
         <w:rPr>
           <w:b/>
-          <w:highlight w:val="yellow"/>
         </w:rPr>
-        <w:t>[TO CONFIRM]</w:t>
-      </w:r>
-      <w:r>
-        <w:t xml:space="preserve"> Actual section meeting day and time.</w:t>
+        <w:t/>
+      </w:r>
+      <w:r>
+        <w:t/>
       </w:r>
     </w:p>
     <w:tbl>
@@ -5598,7 +5590,7 @@
         <w:pStyle w:val="ListBullet"/>
       </w:pPr>
       <w:r>
-        <w:t>[ ] Confirm course code, credit hours, sections, meeting pattern, and modality.</w:t>
+        <w:t xml:space="preserve">[x] EPOL 590, Section AIL, CRN 73886, 4 credit hours; online Mondays 5:00–7:50 PM Central.</w:t>
       </w:r>
     </w:p>
     <w:p>

</xml_diff>

<commit_message>
Standardize final review length and preserve Canvas edits and launch preparation
</commit_message>
<xml_diff>
--- a/courses/590-fall-2026/syllabus/University-of-Illinois-Urbana-Champaign-Syllabus-590-Fall-2026-Draft.docx
+++ b/courses/590-fall-2026/syllabus/University-of-Illinois-Urbana-Champaign-Syllabus-590-Fall-2026-Draft.docx
@@ -2656,7 +2656,7 @@
     </w:p>
     <w:p>
       <w:r>
-        <w:t xml:space="preserve">Include an AI-use statement and a short revision memo explaining how the review changed in response to evidence and feedback. </w:t>
+        <w:t xml:space="preserve">The final literature review is 1,500–2,000 words. Include an AI-use statement and a short revision memo explaining how the review changed in response to evidence and feedback. </w:t>
       </w:r>
       <w:r>
         <w:rPr>
@@ -2666,7 +2666,7 @@
         <w:t>[TO CONFIRM]</w:t>
       </w:r>
       <w:r>
-        <w:t xml:space="preserve"> Word range, citation expectations, submission format, memo length, and the detailed rubric.</w:t>
+        <w:t xml:space="preserve"> Citation expectations, submission format, memo length, and the detailed rubric.</w:t>
       </w:r>
     </w:p>
     <w:p>

</xml_diff>

<commit_message>
590: keep only lecture-sourced readings; align Lecture 1; move planning docs to drafts
Readings: the syllabus, the Word syllabus and Canvas now list only the
readings already in the lecture materials. Sessions 5-7 go back to "to
be selected". The annotated draft with added suggestions is removed.

Syllabus: restore the missing commas in the schedule's focus column,
and rename Task 6's heading to its Canvas name.

Lecture 1: the Markdown and PowerPoint now show the 2026 sessions with
dates, the Canvas task names and due dates, and the six syllabus
criteria. The duplicate "Consequences" slide and section are removed.

canvas-setup.md and desktop-handoff.md are instructor planning notes,
so they move to _drafts/. canvas-setup.html comes off the public site,
and the sitemap is regenerated.

Co-Authored-By: Claude Opus 5.5 <noreply@anthropic.com>
</commit_message>
<xml_diff>
--- a/courses/590-fall-2026/syllabus/University-of-Illinois-Urbana-Champaign-Syllabus-590-Fall-2026-Draft.docx
+++ b/courses/590-fall-2026/syllabus/University-of-Illinois-Urbana-Champaign-Syllabus-590-Fall-2026-Draft.docx
@@ -1084,7 +1084,7 @@
           <w:b w:val="0"/>
           <w:i w:val="0"/>
         </w:rPr>
-        <w:t xml:space="preserve">No book purchase is required. Readings will be posted on Canvas as library links or course copies, under each session's module. Read the required readings before the seminar; the optional readings are there for students whose projects call for them. </w:t>
+        <w:t xml:space="preserve">No book purchase is required. Readings will be posted on Canvas under each session's module. </w:t>
       </w:r>
       <w:r>
         <w:rPr>
@@ -1099,7 +1099,7 @@
           <w:b w:val="0"/>
           <w:i w:val="0"/>
         </w:rPr>
-        <w:t xml:space="preserve"> Editions, excerpts, page ranges, and student access.</w:t>
+        <w:t xml:space="preserve"> The final reading list, editions, excerpts, and student access.</w:t>
       </w:r>
     </w:p>
     <w:p>
@@ -1119,7 +1119,7 @@
           <w:b w:val="0"/>
           <w:i w:val="0"/>
         </w:rPr>
-        <w:t xml:space="preserve">Required: Weber, M. (1946). Science as a vocation. In H. H. Gerth &amp; C. W. Mills (Eds. &amp; Trans.), </w:t>
+        <w:t xml:space="preserve">Weber, M. (1946). Science as a vocation. In H. H. Gerth &amp; C. W. Mills (Eds. &amp; Trans.), </w:t>
       </w:r>
       <w:r>
         <w:rPr>
@@ -1145,7 +1145,7 @@
           <w:b w:val="0"/>
           <w:i w:val="0"/>
         </w:rPr>
-        <w:t xml:space="preserve">Required: University of Minnesota Libraries. (n.d.). </w:t>
+        <w:t xml:space="preserve">University of Minnesota Libraries. (n.d.). </w:t>
       </w:r>
       <w:hyperlink r:id="rId55">
         <w:r>
@@ -1180,43 +1180,9 @@
           <w:b w:val="0"/>
           <w:i w:val="0"/>
         </w:rPr>
-        <w:t xml:space="preserve">Required: Grant, M. J., &amp; Booth, A. (2009). A typology of reviews: An analysis of 14 review types and associated methodologies. </w:t>
-      </w:r>
-      <w:r>
-        <w:rPr>
-          <w:b w:val="0"/>
-          <w:i/>
-        </w:rPr>
-        <w:t>Health Information &amp; Libraries Journal, 26</w:t>
-      </w:r>
-      <w:r>
-        <w:rPr>
-          <w:b w:val="0"/>
-          <w:i w:val="0"/>
-        </w:rPr>
-        <w:t xml:space="preserve">(2), 91–108. </w:t>
+        <w:t xml:space="preserve">Purdue Online Writing Lab. (n.d.). </w:t>
       </w:r>
       <w:hyperlink r:id="rId56">
-        <w:r>
-          <w:rPr>
-            <w:u w:val="single"/>
-          </w:rPr>
-          <w:t>doi:10.1111/j.1471-1842.2009.00848.x</w:t>
-        </w:r>
-      </w:hyperlink>
-    </w:p>
-    <w:p>
-      <w:pPr>
-        <w:pStyle w:val="ListBullet"/>
-      </w:pPr>
-      <w:r>
-        <w:rPr>
-          <w:b w:val="0"/>
-          <w:i w:val="0"/>
-        </w:rPr>
-        <w:t xml:space="preserve">Required: Purdue Online Writing Lab. (n.d.). </w:t>
-      </w:r>
-      <w:hyperlink r:id="rId57">
         <w:r>
           <w:rPr>
             <w:u w:val="single"/>
@@ -1257,7 +1223,7 @@
         </w:rPr>
         <w:t xml:space="preserve">. </w:t>
       </w:r>
-      <w:hyperlink r:id="rId58">
+      <w:hyperlink r:id="rId57">
         <w:r>
           <w:rPr>
             <w:u w:val="single"/>
@@ -1291,7 +1257,7 @@
         </w:rPr>
         <w:t xml:space="preserve">, Article 105473. </w:t>
       </w:r>
-      <w:hyperlink r:id="rId59">
+      <w:hyperlink r:id="rId58">
         <w:r>
           <w:rPr>
             <w:u w:val="single"/>
@@ -1317,7 +1283,7 @@
           <w:b w:val="0"/>
           <w:i w:val="0"/>
         </w:rPr>
-        <w:t xml:space="preserve">Required: Moretti, F. (2013). </w:t>
+        <w:t xml:space="preserve">Moretti, F. (2013). </w:t>
       </w:r>
       <w:r>
         <w:rPr>
@@ -1331,7 +1297,7 @@
           <w:b w:val="0"/>
           <w:i w:val="0"/>
         </w:rPr>
-        <w:t>. Verso. Two chapters: "Conjectures on world literature" and "Graphs, maps, trees".</w:t>
+        <w:t>. Verso.</w:t>
       </w:r>
     </w:p>
     <w:p>
@@ -1343,7 +1309,7 @@
           <w:b w:val="0"/>
           <w:i w:val="0"/>
         </w:rPr>
-        <w:t xml:space="preserve">Optional: Snow, C. P. (1959). </w:t>
+        <w:t xml:space="preserve">Snow, C. P. (1959). </w:t>
       </w:r>
       <w:r>
         <w:rPr>
@@ -1377,7 +1343,7 @@
           <w:b w:val="0"/>
           <w:i w:val="0"/>
         </w:rPr>
-        <w:t xml:space="preserve">Required: Spivak, G. C. (1988). Can the subaltern speak? In C. Nelson &amp; L. Grossberg (Eds.), </w:t>
+        <w:t xml:space="preserve">Spivak, G. C. (1988). Can the subaltern speak? In C. Nelson &amp; L. Grossberg (Eds.), </w:t>
       </w:r>
       <w:r>
         <w:rPr>
@@ -1399,255 +1365,24 @@
         <w:pStyle w:val="Heading2"/>
       </w:pPr>
       <w:r>
-        <w:t>Session 5 · Structure, signposting and scholarly communities</w:t>
-      </w:r>
-    </w:p>
-    <w:p>
-      <w:pPr>
-        <w:pStyle w:val="ListBullet"/>
-      </w:pPr>
-      <w:r>
-        <w:rPr>
-          <w:b w:val="0"/>
-          <w:i w:val="0"/>
-        </w:rPr>
-        <w:t xml:space="preserve">Required: Hyland, K. (2005). </w:t>
-      </w:r>
-      <w:r>
-        <w:rPr>
-          <w:b w:val="0"/>
-          <w:i/>
-        </w:rPr>
-        <w:t>Metadiscourse: Exploring interaction in writing</w:t>
-      </w:r>
-      <w:r>
-        <w:rPr>
-          <w:b w:val="0"/>
-          <w:i w:val="0"/>
-        </w:rPr>
-        <w:t>. Continuum. One chapter on the interpersonal model of metadiscourse.</w:t>
-      </w:r>
-    </w:p>
-    <w:p>
-      <w:pPr>
-        <w:pStyle w:val="ListBullet"/>
-      </w:pPr>
-      <w:r>
-        <w:rPr>
-          <w:b w:val="0"/>
-          <w:i w:val="0"/>
-        </w:rPr>
-        <w:t xml:space="preserve">Required: Berger, P. L., &amp; Luckmann, T. (1966). </w:t>
-      </w:r>
-      <w:r>
-        <w:rPr>
-          <w:b w:val="0"/>
-          <w:i/>
-        </w:rPr>
-        <w:t>The social construction of reality: A treatise in the sociology of knowledge</w:t>
-      </w:r>
-      <w:r>
-        <w:rPr>
-          <w:b w:val="0"/>
-          <w:i w:val="0"/>
-        </w:rPr>
-        <w:t>. Doubleday. Introduction.</w:t>
-      </w:r>
-    </w:p>
-    <w:p>
-      <w:pPr>
-        <w:pStyle w:val="ListBullet"/>
-      </w:pPr>
-      <w:r>
-        <w:rPr>
-          <w:b w:val="0"/>
-          <w:i w:val="0"/>
-        </w:rPr>
-        <w:t xml:space="preserve">Optional: Swales, J. M. (1990). </w:t>
-      </w:r>
-      <w:r>
-        <w:rPr>
-          <w:b w:val="0"/>
-          <w:i/>
-        </w:rPr>
-        <w:t>Genre analysis: English in academic and research settings</w:t>
-      </w:r>
-      <w:r>
-        <w:rPr>
-          <w:b w:val="0"/>
-          <w:i w:val="0"/>
-        </w:rPr>
-        <w:t>. Cambridge University Press. The chapter on discourse communities.</w:t>
-      </w:r>
-    </w:p>
-    <w:p>
-      <w:pPr>
-        <w:pStyle w:val="Heading2"/>
-      </w:pPr>
-      <w:r>
-        <w:t>Session 6 · Reflexivity, positionality and AI in scholarship</w:t>
-      </w:r>
-    </w:p>
-    <w:p>
-      <w:pPr>
-        <w:pStyle w:val="ListBullet"/>
-      </w:pPr>
-      <w:r>
-        <w:rPr>
-          <w:b w:val="0"/>
-          <w:i w:val="0"/>
-        </w:rPr>
-        <w:t xml:space="preserve">Required: Haraway, D. (1988). Situated knowledges: The science question in feminism and the privilege of partial perspective. </w:t>
-      </w:r>
-      <w:r>
-        <w:rPr>
-          <w:b w:val="0"/>
-          <w:i/>
-        </w:rPr>
-        <w:t>Feminist Studies, 14</w:t>
-      </w:r>
-      <w:r>
-        <w:rPr>
-          <w:b w:val="0"/>
-          <w:i w:val="0"/>
-        </w:rPr>
-        <w:t xml:space="preserve">(3), 575–599. </w:t>
-      </w:r>
-      <w:hyperlink r:id="rId60">
-        <w:r>
-          <w:rPr>
-            <w:u w:val="single"/>
-          </w:rPr>
-          <w:t>doi:10.2307/3178066</w:t>
-        </w:r>
-      </w:hyperlink>
-    </w:p>
-    <w:p>
-      <w:pPr>
-        <w:pStyle w:val="ListBullet"/>
-      </w:pPr>
-      <w:r>
-        <w:rPr>
-          <w:b w:val="0"/>
-          <w:i w:val="0"/>
-        </w:rPr>
-        <w:t xml:space="preserve">Required: Bender, E. M., Gebru, T., McMillan-Major, A., &amp; Shmitchell, S. (2021). On the dangers of stochastic parrots: Can language models be too big? In </w:t>
-      </w:r>
-      <w:r>
-        <w:rPr>
-          <w:b w:val="0"/>
-          <w:i/>
-        </w:rPr>
-        <w:t>Proceedings of the 2021 ACM Conference on Fairness, Accountability, and Transparency</w:t>
-      </w:r>
-      <w:r>
-        <w:rPr>
-          <w:b w:val="0"/>
-          <w:i w:val="0"/>
-        </w:rPr>
-        <w:t xml:space="preserve"> (pp. 610–623). </w:t>
-      </w:r>
-      <w:hyperlink r:id="rId61">
-        <w:r>
-          <w:rPr>
-            <w:u w:val="single"/>
-          </w:rPr>
-          <w:t>doi:10.1145/3442188.3445922</w:t>
-        </w:r>
-      </w:hyperlink>
-    </w:p>
-    <w:p>
-      <w:pPr>
-        <w:pStyle w:val="ListBullet"/>
-      </w:pPr>
-      <w:r>
-        <w:rPr>
-          <w:b w:val="0"/>
-          <w:i w:val="0"/>
-        </w:rPr>
-        <w:t xml:space="preserve">Optional: Harding, S. (1992). Rethinking standpoint epistemology: What is "strong objectivity"? </w:t>
-      </w:r>
-      <w:r>
-        <w:rPr>
-          <w:b w:val="0"/>
-          <w:i/>
-        </w:rPr>
-        <w:t>The Centennial Review, 36</w:t>
-      </w:r>
-      <w:r>
-        <w:rPr>
-          <w:b w:val="0"/>
-          <w:i w:val="0"/>
-        </w:rPr>
-        <w:t>(3), 437–470.</w:t>
-      </w:r>
-    </w:p>
-    <w:p>
-      <w:pPr>
-        <w:pStyle w:val="Heading2"/>
-      </w:pPr>
-      <w:r>
-        <w:t>Session 7 · The future of scholarship and final review workshop</w:t>
-      </w:r>
-    </w:p>
-    <w:p>
-      <w:pPr>
-        <w:pStyle w:val="ListBullet"/>
-      </w:pPr>
-      <w:r>
-        <w:rPr>
-          <w:b w:val="0"/>
-          <w:i w:val="0"/>
-        </w:rPr>
-        <w:t xml:space="preserve">Required: Messeri, L., &amp; Crockett, M. J. (2024). Artificial intelligence and illusions of understanding in scientific research. </w:t>
-      </w:r>
-      <w:r>
-        <w:rPr>
-          <w:b w:val="0"/>
-          <w:i/>
-        </w:rPr>
-        <w:t>Nature, 627</w:t>
-      </w:r>
-      <w:r>
-        <w:rPr>
-          <w:b w:val="0"/>
-          <w:i w:val="0"/>
-        </w:rPr>
-        <w:t xml:space="preserve">, 49–58. </w:t>
-      </w:r>
-      <w:hyperlink r:id="rId62">
-        <w:r>
-          <w:rPr>
-            <w:u w:val="single"/>
-          </w:rPr>
-          <w:t>doi:10.1038/s41586-024-07146-0</w:t>
-        </w:r>
-      </w:hyperlink>
-    </w:p>
-    <w:p>
-      <w:pPr>
-        <w:pStyle w:val="ListBullet"/>
-      </w:pPr>
-      <w:r>
-        <w:rPr>
-          <w:b w:val="0"/>
-          <w:i w:val="0"/>
-        </w:rPr>
-        <w:t xml:space="preserve">Optional: Bush, V. (1945). As we may think. </w:t>
-      </w:r>
-      <w:r>
-        <w:rPr>
-          <w:b w:val="0"/>
-          <w:i/>
-        </w:rPr>
-        <w:t>The Atlantic Monthly, 176</w:t>
-      </w:r>
-      <w:r>
-        <w:rPr>
-          <w:b w:val="0"/>
-          <w:i w:val="0"/>
-        </w:rPr>
-        <w:t>(1), 101–108.</w:t>
+        <w:t>Sessions 5–7</w:t>
+      </w:r>
+    </w:p>
+    <w:p>
+      <w:r>
+        <w:rPr>
+          <w:b/>
+          <w:i w:val="0"/>
+          <w:highlight w:val="yellow"/>
+        </w:rPr>
+        <w:t>[TO CONFIRM]</w:t>
+      </w:r>
+      <w:r>
+        <w:rPr>
+          <w:b w:val="0"/>
+          <w:i w:val="0"/>
+        </w:rPr>
+        <w:t xml:space="preserve"> A sociology-of-knowledge reading for Session 5, a reflection reading for Session 6, and a case on automation for Session 7.</w:t>
       </w:r>
     </w:p>
     <w:p>
@@ -3559,7 +3294,7 @@
         <w:pStyle w:val="Heading2"/>
       </w:pPr>
       <w:r>
-        <w:t>6 AI use and reflexive commentary</w:t>
+        <w:t>6 AI-use statement and reflexive commentary</w:t>
       </w:r>
     </w:p>
     <w:p>
@@ -4982,7 +4717,7 @@
         </w:rPr>
         <w:t xml:space="preserve"> Contact the instructor about access needs and consult </w:t>
       </w:r>
-      <w:hyperlink r:id="rId63">
+      <w:hyperlink r:id="rId59">
         <w:r>
           <w:rPr>
             <w:u w:val="single"/>
@@ -5059,7 +4794,7 @@
         </w:rPr>
         <w:t xml:space="preserve"> The </w:t>
       </w:r>
-      <w:hyperlink r:id="rId64">
+      <w:hyperlink r:id="rId60">
         <w:r>
           <w:rPr>
             <w:u w:val="single"/>
@@ -5105,7 +4840,7 @@
         </w:rPr>
         <w:t xml:space="preserve"> Support information is available through the </w:t>
       </w:r>
-      <w:hyperlink r:id="rId65">
+      <w:hyperlink r:id="rId61">
         <w:r>
           <w:rPr>
             <w:u w:val="single"/>
@@ -5623,7 +5358,7 @@
                 <w:i w:val="0"/>
                 <w:sz w:val="19"/>
               </w:rPr>
-              <w:t>Article anatomy review design and mapping a field</w:t>
+              <w:t>Article anatomy, review design and mapping a field</w:t>
             </w:r>
           </w:p>
         </w:tc>
@@ -5654,7 +5389,7 @@
                 <w:i w:val="0"/>
                 <w:sz w:val="19"/>
               </w:rPr>
-              <w:t>Grant &amp; Booth; Purdue OWL; compare articles from your field</w:t>
+              <w:t>Purdue OWL; compare articles from your field</w:t>
             </w:r>
           </w:p>
         </w:tc>
@@ -5814,7 +5549,7 @@
                 <w:i w:val="0"/>
                 <w:sz w:val="19"/>
               </w:rPr>
-              <w:t>Moretti; annotate a difficult passage; prepare a source-backed conceptual map</w:t>
+              <w:t>Moretti; Snow; annotate a difficult passage; prepare a source-backed conceptual map</w:t>
             </w:r>
           </w:p>
         </w:tc>
@@ -5943,7 +5678,7 @@
                 <w:i w:val="0"/>
                 <w:sz w:val="19"/>
               </w:rPr>
-              <w:t>Difficult texts audiences and scholarly voice</w:t>
+              <w:t>Difficult texts, audiences and scholarly voice</w:t>
             </w:r>
           </w:p>
         </w:tc>
@@ -6103,7 +5838,7 @@
                 <w:i w:val="0"/>
                 <w:sz w:val="19"/>
               </w:rPr>
-              <w:t>Structure signposting and scholarly communities</w:t>
+              <w:t>Structure, signposting and scholarly communities</w:t>
             </w:r>
           </w:p>
         </w:tc>
@@ -6134,7 +5869,7 @@
                 <w:i w:val="0"/>
                 <w:sz w:val="19"/>
               </w:rPr>
-              <w:t>Hyland; Berger &amp; Luckmann; bring an outline and draft</w:t>
+              <w:t>Bring an outline and draft; sociology-of-knowledge reading to be selected</w:t>
             </w:r>
           </w:p>
         </w:tc>
@@ -6423,7 +6158,7 @@
                 <w:i w:val="0"/>
                 <w:sz w:val="19"/>
               </w:rPr>
-              <w:t>Reflexivity positionality and AI in scholarship</w:t>
+              <w:t>Reflexivity, positionality and AI in scholarship</w:t>
             </w:r>
           </w:p>
         </w:tc>
@@ -6454,7 +6189,7 @@
                 <w:i w:val="0"/>
                 <w:sz w:val="19"/>
               </w:rPr>
-              <w:t>Haraway; Bender et al.; revisit the draft and AI-use record</w:t>
+              <w:t>Revisit the draft and AI-use record; reflection reading to be selected</w:t>
             </w:r>
           </w:p>
         </w:tc>
@@ -6614,7 +6349,7 @@
                 <w:i w:val="0"/>
                 <w:sz w:val="19"/>
               </w:rPr>
-              <w:t>Messeri &amp; Crockett; bring a complete working draft</w:t>
+              <w:t>Bring a complete working draft; selected case on automation</w:t>
             </w:r>
           </w:p>
         </w:tc>
@@ -6961,7 +6696,7 @@
         </w:rPr>
         <w:t xml:space="preserve">Structure adapted from </w:t>
       </w:r>
-      <w:hyperlink r:id="rId66">
+      <w:hyperlink r:id="rId62">
         <w:r>
           <w:rPr>
             <w:u w:val="single"/>
@@ -6976,7 +6711,7 @@
         </w:rPr>
         <w:t xml:space="preserve">. Course content and starting weights come from the </w:t>
       </w:r>
-      <w:hyperlink r:id="rId67">
+      <w:hyperlink r:id="rId63">
         <w:r>
           <w:rPr>
             <w:u w:val="single"/>
@@ -7000,7 +6735,7 @@
         </w:rPr>
         <w:t xml:space="preserve">Official calendar anchors: </w:t>
       </w:r>
-      <w:hyperlink r:id="rId68">
+      <w:hyperlink r:id="rId64">
         <w:r>
           <w:rPr>
             <w:u w:val="single"/>

</xml_diff>

<commit_message>
590: staged tasks due the Monday after each seminar
Tasks 1-6 move from Friday to Monday 11:59 PM Central: 26 Oct, 2 Nov,
9 Nov, 16 Nov, 30 Nov (Task 5 waits until after fall break, so the break
stays deadline-free) and 7 Dec. Final review stays Tuesday 15 Dec.

- syllabus.md (+ rebuilt Word syllabus), lecture-1.md
- course.md brought in line with the syllabus: description, objectives,
  readings, session table with due dates, assessment weights

Canvas assignment due dates, peer-review start dates, the Canvas syllabus
and the Lecture 1 page were updated to match.

Co-Authored-By: Claude Opus 5.5 <noreply@anthropic.com>
</commit_message>
<xml_diff>
--- a/courses/590-fall-2026/syllabus/University-of-Illinois-Urbana-Champaign-Syllabus-590-Fall-2026-Draft.docx
+++ b/courses/590-fall-2026/syllabus/University-of-Illinois-Urbana-Champaign-Syllabus-590-Fall-2026-Draft.docx
@@ -1964,7 +1964,7 @@
           <w:b w:val="0"/>
           <w:i w:val="0"/>
         </w:rPr>
-        <w:t>Fall break has no scheduled seminar or submission in the proposed plan. Start the Week 6 reflection before the break if useful, but plan to complete it after teaching resumes.</w:t>
+        <w:t>Fall break has no scheduled seminar or submission. The structured draft (Task 5) is due the Monday after the break, 30 November. Start the Week 6 reflection before the break if useful, but plan to complete it after teaching resumes.</w:t>
       </w:r>
     </w:p>
     <w:p>
@@ -2290,7 +2290,7 @@
                 <w:i w:val="0"/>
                 <w:sz w:val="20"/>
               </w:rPr>
-              <w:t>Friday 23 October</w:t>
+              <w:t>Monday 26 October</w:t>
             </w:r>
           </w:p>
         </w:tc>
@@ -2388,7 +2388,7 @@
                 <w:i w:val="0"/>
                 <w:sz w:val="20"/>
               </w:rPr>
-              <w:t>Friday 30 October</w:t>
+              <w:t>Monday 2 November</w:t>
             </w:r>
           </w:p>
         </w:tc>
@@ -2486,7 +2486,7 @@
                 <w:i w:val="0"/>
                 <w:sz w:val="20"/>
               </w:rPr>
-              <w:t>Friday 6 November</w:t>
+              <w:t>Monday 9 November</w:t>
             </w:r>
           </w:p>
         </w:tc>
@@ -2584,7 +2584,7 @@
                 <w:i w:val="0"/>
                 <w:sz w:val="20"/>
               </w:rPr>
-              <w:t>Friday 13 November</w:t>
+              <w:t>Monday 16 November</w:t>
             </w:r>
           </w:p>
         </w:tc>
@@ -2682,7 +2682,7 @@
                 <w:i w:val="0"/>
                 <w:sz w:val="20"/>
               </w:rPr>
-              <w:t>Friday 20 November</w:t>
+              <w:t>Monday 30 November</w:t>
             </w:r>
           </w:p>
         </w:tc>
@@ -2780,7 +2780,7 @@
                 <w:i w:val="0"/>
                 <w:sz w:val="20"/>
               </w:rPr>
-              <w:t>Friday 4 December</w:t>
+              <w:t>Monday 7 December</w:t>
             </w:r>
           </w:p>
         </w:tc>
@@ -5260,7 +5260,7 @@
                 <w:i w:val="0"/>
                 <w:sz w:val="19"/>
               </w:rPr>
-              <w:t>Topic and question, 23 October</w:t>
+              <w:t>Topic and question, 26 October</w:t>
             </w:r>
           </w:p>
         </w:tc>
@@ -5420,7 +5420,7 @@
                 <w:i w:val="0"/>
                 <w:sz w:val="19"/>
               </w:rPr>
-              <w:t>Review plan, 30 October</w:t>
+              <w:t>Review plan, 2 November</w:t>
             </w:r>
           </w:p>
         </w:tc>
@@ -5580,7 +5580,7 @@
                 <w:i w:val="0"/>
                 <w:sz w:val="19"/>
               </w:rPr>
-              <w:t>Conceptual map, 6 November</w:t>
+              <w:t>Conceptual map, 9 November</w:t>
             </w:r>
           </w:p>
         </w:tc>
@@ -5740,7 +5740,7 @@
                 <w:i w:val="0"/>
                 <w:sz w:val="19"/>
               </w:rPr>
-              <w:t>Writing sample, 13 November; peer workshop</w:t>
+              <w:t>Writing sample, 16 November; peer workshop</w:t>
             </w:r>
           </w:p>
         </w:tc>
@@ -5900,7 +5900,7 @@
                 <w:i w:val="0"/>
                 <w:sz w:val="19"/>
               </w:rPr>
-              <w:t>Structured draft, 20 November</w:t>
+              <w:t>Structured draft, 30 November</w:t>
             </w:r>
           </w:p>
         </w:tc>
@@ -6220,7 +6220,7 @@
                 <w:i w:val="0"/>
                 <w:sz w:val="19"/>
               </w:rPr>
-              <w:t>AI and reflexivity statement, 4 December; peer workshop</w:t>
+              <w:t>AI and reflexivity statement, 7 December; peer workshop</w:t>
             </w:r>
           </w:p>
         </w:tc>

</xml_diff>

<commit_message>
590: Task 1 ungraded; two 5% peer reviews (Tasks 4 and 6)
Weights: Tasks 2-6 10% each (50%), peer reviews of Tasks 4 and 6 5% each
(10%, complete/incomplete, due Fri 20 Nov and Fri 11 Dec), final review
40%. Task 1 stays as a feedback-only submission on 26 Oct.

Updated syllabus.md (+ Word), course.md and lecture-1.md. Canvas weights,
assignments, modules, syllabus and Lecture 1 page match.

Co-Authored-By: Claude Opus 5.5 <noreply@anthropic.com>
</commit_message>
<xml_diff>
--- a/courses/590-fall-2026/syllabus/University-of-Illinois-Urbana-Champaign-Syllabus-590-Fall-2026-Draft.docx
+++ b/courses/590-fall-2026/syllabus/University-of-Illinois-Urbana-Champaign-Syllabus-590-Fall-2026-Draft.docx
@@ -2080,7 +2080,7 @@
           <w:b w:val="0"/>
           <w:i w:val="0"/>
         </w:rPr>
-        <w:t>The starting assessment structure retains the six staged tasks and final review from the previous 590 course.</w:t>
+        <w:t>The review is built in stages. Task 1 is ungraded: it gets feedback early, before any marks are at stake. Two peer reviews, on Tasks 4 and 6, count for 5% each.</w:t>
       </w:r>
     </w:p>
     <w:tbl>
@@ -2259,7 +2259,7 @@
                 <w:i w:val="0"/>
                 <w:sz w:val="20"/>
               </w:rPr>
-              <w:t>10%</w:t>
+              <w:t>Ungraded (feedback only)</w:t>
             </w:r>
           </w:p>
         </w:tc>
@@ -2816,7 +2816,7 @@
                 <w:i w:val="0"/>
                 <w:sz w:val="20"/>
               </w:rPr>
-              <w:t>7 Final literature review</w:t>
+              <w:t>Peer review of Task 4</w:t>
             </w:r>
           </w:p>
         </w:tc>
@@ -2847,7 +2847,7 @@
                 <w:i w:val="0"/>
                 <w:sz w:val="20"/>
               </w:rPr>
-              <w:t>40%</w:t>
+              <w:t>5%</w:t>
             </w:r>
           </w:p>
         </w:tc>
@@ -2878,7 +2878,7 @@
                 <w:i w:val="0"/>
                 <w:sz w:val="20"/>
               </w:rPr>
-              <w:t>Tuesday 15 December</w:t>
+              <w:t>Friday 20 November</w:t>
             </w:r>
           </w:p>
         </w:tc>
@@ -2910,6 +2910,202 @@
             </w:pPr>
             <w:r>
               <w:rPr>
+                <w:b w:val="0"/>
+                <w:i w:val="0"/>
+                <w:sz w:val="20"/>
+              </w:rPr>
+              <w:t>Peer review of Task 6</w:t>
+            </w:r>
+          </w:p>
+        </w:tc>
+        <w:tc>
+          <w:tcPr>
+            <w:tcW w:type="dxa" w:w="936"/>
+            <w:vAlign w:val="center"/>
+            <w:tcBorders>
+              <w:top w:val="single" w:sz="4" w:color="D9D9D9"/>
+              <w:left w:val="single" w:sz="4" w:color="D9D9D9"/>
+              <w:bottom w:val="single" w:sz="4" w:color="D9D9D9"/>
+              <w:right w:val="single" w:sz="4" w:color="D9D9D9"/>
+            </w:tcBorders>
+            <w:tcMar>
+              <w:top w:w="90" w:type="dxa"/>
+              <w:left w:w="90" w:type="dxa"/>
+              <w:bottom w:w="90" w:type="dxa"/>
+              <w:right w:w="90" w:type="dxa"/>
+            </w:tcMar>
+          </w:tcPr>
+          <w:p>
+            <w:pPr>
+              <w:spacing w:after="20" w:before="20" w:line="240" w:lineRule="auto"/>
+            </w:pPr>
+            <w:r>
+              <w:rPr>
+                <w:b w:val="0"/>
+                <w:i w:val="0"/>
+                <w:sz w:val="20"/>
+              </w:rPr>
+              <w:t>5%</w:t>
+            </w:r>
+          </w:p>
+        </w:tc>
+        <w:tc>
+          <w:tcPr>
+            <w:tcW w:type="dxa" w:w="3312"/>
+            <w:vAlign w:val="center"/>
+            <w:tcBorders>
+              <w:top w:val="single" w:sz="4" w:color="D9D9D9"/>
+              <w:left w:val="single" w:sz="4" w:color="D9D9D9"/>
+              <w:bottom w:val="single" w:sz="4" w:color="D9D9D9"/>
+              <w:right w:val="single" w:sz="4" w:color="D9D9D9"/>
+            </w:tcBorders>
+            <w:tcMar>
+              <w:top w:w="90" w:type="dxa"/>
+              <w:left w:w="90" w:type="dxa"/>
+              <w:bottom w:w="90" w:type="dxa"/>
+              <w:right w:w="90" w:type="dxa"/>
+            </w:tcMar>
+          </w:tcPr>
+          <w:p>
+            <w:pPr>
+              <w:spacing w:after="20" w:before="20" w:line="240" w:lineRule="auto"/>
+            </w:pPr>
+            <w:r>
+              <w:rPr>
+                <w:b w:val="0"/>
+                <w:i w:val="0"/>
+                <w:sz w:val="20"/>
+              </w:rPr>
+              <w:t>Friday 11 December</w:t>
+            </w:r>
+          </w:p>
+        </w:tc>
+      </w:tr>
+      <w:tr>
+        <w:trPr>
+          <w:cantSplit/>
+        </w:trPr>
+        <w:tc>
+          <w:tcPr>
+            <w:tcW w:type="dxa" w:w="5112"/>
+            <w:vAlign w:val="center"/>
+            <w:tcBorders>
+              <w:top w:val="single" w:sz="4" w:color="D9D9D9"/>
+              <w:left w:val="single" w:sz="4" w:color="D9D9D9"/>
+              <w:bottom w:val="single" w:sz="4" w:color="D9D9D9"/>
+              <w:right w:val="single" w:sz="4" w:color="D9D9D9"/>
+            </w:tcBorders>
+            <w:tcMar>
+              <w:top w:w="90" w:type="dxa"/>
+              <w:left w:w="90" w:type="dxa"/>
+              <w:bottom w:w="90" w:type="dxa"/>
+              <w:right w:w="90" w:type="dxa"/>
+            </w:tcMar>
+          </w:tcPr>
+          <w:p>
+            <w:pPr>
+              <w:spacing w:after="20" w:before="20" w:line="240" w:lineRule="auto"/>
+            </w:pPr>
+            <w:r>
+              <w:rPr>
+                <w:b w:val="0"/>
+                <w:i w:val="0"/>
+                <w:sz w:val="20"/>
+              </w:rPr>
+              <w:t>7 Final literature review</w:t>
+            </w:r>
+          </w:p>
+        </w:tc>
+        <w:tc>
+          <w:tcPr>
+            <w:tcW w:type="dxa" w:w="936"/>
+            <w:vAlign w:val="center"/>
+            <w:tcBorders>
+              <w:top w:val="single" w:sz="4" w:color="D9D9D9"/>
+              <w:left w:val="single" w:sz="4" w:color="D9D9D9"/>
+              <w:bottom w:val="single" w:sz="4" w:color="D9D9D9"/>
+              <w:right w:val="single" w:sz="4" w:color="D9D9D9"/>
+            </w:tcBorders>
+            <w:tcMar>
+              <w:top w:w="90" w:type="dxa"/>
+              <w:left w:w="90" w:type="dxa"/>
+              <w:bottom w:w="90" w:type="dxa"/>
+              <w:right w:w="90" w:type="dxa"/>
+            </w:tcMar>
+          </w:tcPr>
+          <w:p>
+            <w:pPr>
+              <w:spacing w:after="20" w:before="20" w:line="240" w:lineRule="auto"/>
+            </w:pPr>
+            <w:r>
+              <w:rPr>
+                <w:b w:val="0"/>
+                <w:i w:val="0"/>
+                <w:sz w:val="20"/>
+              </w:rPr>
+              <w:t>40%</w:t>
+            </w:r>
+          </w:p>
+        </w:tc>
+        <w:tc>
+          <w:tcPr>
+            <w:tcW w:type="dxa" w:w="3312"/>
+            <w:vAlign w:val="center"/>
+            <w:tcBorders>
+              <w:top w:val="single" w:sz="4" w:color="D9D9D9"/>
+              <w:left w:val="single" w:sz="4" w:color="D9D9D9"/>
+              <w:bottom w:val="single" w:sz="4" w:color="D9D9D9"/>
+              <w:right w:val="single" w:sz="4" w:color="D9D9D9"/>
+            </w:tcBorders>
+            <w:tcMar>
+              <w:top w:w="90" w:type="dxa"/>
+              <w:left w:w="90" w:type="dxa"/>
+              <w:bottom w:w="90" w:type="dxa"/>
+              <w:right w:w="90" w:type="dxa"/>
+            </w:tcMar>
+          </w:tcPr>
+          <w:p>
+            <w:pPr>
+              <w:spacing w:after="20" w:before="20" w:line="240" w:lineRule="auto"/>
+            </w:pPr>
+            <w:r>
+              <w:rPr>
+                <w:b w:val="0"/>
+                <w:i w:val="0"/>
+                <w:sz w:val="20"/>
+              </w:rPr>
+              <w:t>Tuesday 15 December</w:t>
+            </w:r>
+          </w:p>
+        </w:tc>
+      </w:tr>
+      <w:tr>
+        <w:trPr>
+          <w:cantSplit/>
+        </w:trPr>
+        <w:tc>
+          <w:tcPr>
+            <w:tcW w:type="dxa" w:w="5112"/>
+            <w:vAlign w:val="center"/>
+            <w:tcBorders>
+              <w:top w:val="single" w:sz="4" w:color="D9D9D9"/>
+              <w:left w:val="single" w:sz="4" w:color="D9D9D9"/>
+              <w:bottom w:val="single" w:sz="4" w:color="D9D9D9"/>
+              <w:right w:val="single" w:sz="4" w:color="D9D9D9"/>
+            </w:tcBorders>
+            <w:tcMar>
+              <w:top w:w="90" w:type="dxa"/>
+              <w:left w:w="90" w:type="dxa"/>
+              <w:bottom w:w="90" w:type="dxa"/>
+              <w:right w:w="90" w:type="dxa"/>
+            </w:tcMar>
+          </w:tcPr>
+          <w:p>
+            <w:pPr>
+              <w:spacing w:after="20" w:before="20" w:line="240" w:lineRule="auto"/>
+            </w:pPr>
+            <w:r>
+              <w:rPr>
                 <w:b/>
                 <w:i w:val="0"/>
                 <w:sz w:val="20"/>
@@ -3171,7 +3367,7 @@
           <w:b w:val="0"/>
           <w:i w:val="0"/>
         </w:rPr>
-        <w:t>Self-reflection helps explain your decisions. It does not automatically determine your grade. The 479 self-grading scheme and separately weighted peer-commentary components have been replaced by 590's staged assignments.</w:t>
+        <w:t>Self-reflection helps explain your decisions. It does not automatically determine your grade. The 479 self-grading scheme and separate peer-commentary components have been replaced by 590's staged assignments and two graded peer reviews.</w:t>
       </w:r>
     </w:p>
     <w:p>
@@ -3188,7 +3384,7 @@
           <w:b w:val="0"/>
           <w:i w:val="0"/>
         </w:rPr>
-        <w:t xml:space="preserve">State a provisional question and explain its significance, feasibility, and relationship to an initial set of sources. Identify what you would need to read or discover to refine it. </w:t>
+        <w:t xml:space="preserve">This task is ungraded. It is your first chance to get feedback on your question before any marks are at stake. State a provisional question and explain its significance, feasibility, and relationship to an initial set of sources. Identify what you would need to read or discover to refine it. </w:t>
       </w:r>
       <w:r>
         <w:rPr>
@@ -3483,7 +3679,7 @@
           <w:b w:val="0"/>
           <w:i w:val="0"/>
         </w:rPr>
-        <w:t>Peer workshops are proposed in Sessions 4 and 6, with instructor feedback on the map and structured draft. Peer commentary supports revision and carries no separate percentage in this starting assessment structure.</w:t>
+        <w:t>Peer workshops run in Sessions 4 and 6, with instructor feedback on the map and structured draft. After you submit Tasks 4 and 6, Canvas assigns you classmates' submissions to review. Each peer review is worth 5%. It is graded complete or incomplete: complete means specific, constructive comments on each assigned submission by the review deadline (Friday 20 November for Task 4, Friday 11 December for Task 6). The Task 6 reviews arrive in time to help with the final review.</w:t>
       </w:r>
     </w:p>
     <w:p>

</xml_diff>

<commit_message>
590: attendance, feedback, task lengths, final options, 2026 AI tools
- Attendance: lenient, ungraded, no documentation needed; Student Code
  absences always accommodated
- Feedback: email within two working days, staged-task feedback within
  a week of the due date
- Tasks 1-6 usually 250-400 words; sources depend on the task
- Task 7: Option A literature review, or Option B a course outline for
  teaching how to write a literature review (1,500-2,000 words either way)
- Snow and Spivak: University Library catalog links
- ai-overview.md rewritten for 2026 around the University's approved tools

Canvas syllabus, assignments (Tasks 1-7), AI tools page and Lecture 1
page updated to match.

Co-Authored-By: Claude Opus 5.5 <noreply@anthropic.com>
</commit_message>
<xml_diff>
--- a/courses/590-fall-2026/syllabus/University-of-Illinois-Urbana-Champaign-Syllabus-590-Fall-2026-Draft.docx
+++ b/courses/590-fall-2026/syllabus/University-of-Illinois-Urbana-Champaign-Syllabus-590-Fall-2026-Draft.docx
@@ -1323,8 +1323,16 @@
           <w:b w:val="0"/>
           <w:i w:val="0"/>
         </w:rPr>
-        <w:t>. Cambridge University Press.</w:t>
-      </w:r>
+        <w:t xml:space="preserve">. Cambridge University Press. </w:t>
+      </w:r>
+      <w:hyperlink r:id="rId59">
+        <w:r>
+          <w:rPr>
+            <w:u w:val="single"/>
+          </w:rPr>
+          <w:t>University Library: online, in *The two cultures* with Stefan Collini's introduction</w:t>
+        </w:r>
+      </w:hyperlink>
     </w:p>
     <w:p>
       <w:pPr>
@@ -1357,8 +1365,16 @@
           <w:b w:val="0"/>
           <w:i w:val="0"/>
         </w:rPr>
-        <w:t xml:space="preserve"> (pp. 271–313). University of Illinois Press.</w:t>
-      </w:r>
+        <w:t xml:space="preserve"> (pp. 271–313). University of Illinois Press. </w:t>
+      </w:r>
+      <w:hyperlink r:id="rId60">
+        <w:r>
+          <w:rPr>
+            <w:u w:val="single"/>
+          </w:rPr>
+          <w:t>University Library: print, Communications Library</w:t>
+        </w:r>
+      </w:hyperlink>
     </w:p>
     <w:p>
       <w:pPr>
@@ -2041,29 +2057,14 @@
           <w:b/>
           <w:i w:val="0"/>
         </w:rPr>
-        <w:t>Proposed feedback arrangements:</w:t>
-      </w:r>
-      <w:r>
-        <w:rPr>
-          <w:b w:val="0"/>
-          <w:i w:val="0"/>
-        </w:rPr>
-        <w:t xml:space="preserve"> email responses within two working days and feedback on staged submissions within one week. </w:t>
-      </w:r>
-      <w:r>
-        <w:rPr>
-          <w:b/>
-          <w:i w:val="0"/>
-          <w:highlight w:val="yellow"/>
-        </w:rPr>
-        <w:t>[TO CONFIRM]</w:t>
-      </w:r>
-      <w:r>
-        <w:rPr>
-          <w:b w:val="0"/>
-          <w:i w:val="0"/>
-        </w:rPr>
-        <w:t xml:space="preserve"> Response times and feedback capacity. Plan substantive instructor feedback after the conceptual map and after the structured draft; use peer workshops to support revision between these points.</w:t>
+        <w:t>Feedback and response times:</w:t>
+      </w:r>
+      <w:r>
+        <w:rPr>
+          <w:b w:val="0"/>
+          <w:i w:val="0"/>
+        </w:rPr>
+        <w:t xml:space="preserve"> I aim to reply to email within two working days (Monday to Friday) and to return feedback on staged tasks within one week of the due date. Feedback on the final submission comes with the course grade. Plan substantive instructor feedback after the conceptual map and after the structured draft; use peer workshops to support revision between these points.</w:t>
       </w:r>
     </w:p>
     <w:p>
@@ -3012,7 +3013,7 @@
                 <w:i w:val="0"/>
                 <w:sz w:val="20"/>
               </w:rPr>
-              <w:t>7 Final literature review</w:t>
+              <w:t>7 Final literature review or course outline</w:t>
             </w:r>
           </w:p>
         </w:tc>
@@ -3181,6 +3182,29 @@
           <w:b w:val="0"/>
           <w:i w:val="0"/>
         </w:rPr>
+        <w:t xml:space="preserve">Tasks 1–6 are usually </w:t>
+      </w:r>
+      <w:r>
+        <w:rPr>
+          <w:b/>
+          <w:i w:val="0"/>
+        </w:rPr>
+        <w:t>250–400 words</w:t>
+      </w:r>
+      <w:r>
+        <w:rPr>
+          <w:b w:val="0"/>
+          <w:i w:val="0"/>
+        </w:rPr>
+        <w:t>, plus any map, outline or extract the task asks for. The number and kind of sources depend on what each task asks for.</w:t>
+      </w:r>
+    </w:p>
+    <w:p>
+      <w:r>
+        <w:rPr>
+          <w:b w:val="0"/>
+          <w:i w:val="0"/>
+        </w:rPr>
         <w:t xml:space="preserve">All proposed submissions are due at </w:t>
       </w:r>
       <w:r>
@@ -3384,7 +3408,58 @@
           <w:b w:val="0"/>
           <w:i w:val="0"/>
         </w:rPr>
-        <w:t xml:space="preserve">This task is ungraded. It is your first chance to get feedback on your question before any marks are at stake. State a provisional question and explain its significance, feasibility, and relationship to an initial set of sources. Identify what you would need to read or discover to refine it. </w:t>
+        <w:t>This task is ungraded. It is your first chance to get feedback on your question before any marks are at stake. State a provisional question and explain its significance, feasibility, and relationship to an initial set of sources. Identify what you would need to read or discover to refine it.</w:t>
+      </w:r>
+    </w:p>
+    <w:p>
+      <w:pPr>
+        <w:pStyle w:val="Heading2"/>
+      </w:pPr>
+      <w:r>
+        <w:t>2 Review design method and scope</w:t>
+      </w:r>
+    </w:p>
+    <w:p>
+      <w:r>
+        <w:rPr>
+          <w:b w:val="0"/>
+          <w:i w:val="0"/>
+        </w:rPr>
+        <w:t>Explain the review's purpose, audience, boundaries, search approach, selection criteria, and proposed organization. Distinguish an exploratory course review from any claim to have completed a systematic review. Include enough detail for a reader to understand how the collection was assembled.</w:t>
+      </w:r>
+    </w:p>
+    <w:p>
+      <w:pPr>
+        <w:pStyle w:val="Heading2"/>
+      </w:pPr>
+      <w:r>
+        <w:t>3 Conceptual map of the literature</w:t>
+      </w:r>
+    </w:p>
+    <w:p>
+      <w:r>
+        <w:rPr>
+          <w:b w:val="0"/>
+          <w:i w:val="0"/>
+        </w:rPr>
+        <w:t>Represent the main concepts, debates, approaches, or historical developments in your field. Link important relationships to sources and identify uncertainties or omissions. Accompany the map with a short explanation of how it affects your question and search.</w:t>
+      </w:r>
+    </w:p>
+    <w:p>
+      <w:pPr>
+        <w:pStyle w:val="Heading2"/>
+      </w:pPr>
+      <w:r>
+        <w:t>4 Literature review writing sample</w:t>
+      </w:r>
+    </w:p>
+    <w:p>
+      <w:r>
+        <w:rPr>
+          <w:b w:val="0"/>
+          <w:i w:val="0"/>
+        </w:rPr>
+        <w:t xml:space="preserve">Develop a section that synthesizes literature rather than describing articles one at a time. Compare scientific and humanities modes of framing or interpretation; explain which choices serve your question and audience. </w:t>
       </w:r>
       <w:r>
         <w:rPr>
@@ -3399,7 +3474,7 @@
           <w:b w:val="0"/>
           <w:i w:val="0"/>
         </w:rPr>
-        <w:t xml:space="preserve"> Length and minimum source expectations.</w:t>
+        <w:t xml:space="preserve"> Whether students submit two short versions or one version with commentary.</w:t>
       </w:r>
     </w:p>
     <w:p>
@@ -3407,16 +3482,16 @@
         <w:pStyle w:val="Heading2"/>
       </w:pPr>
       <w:r>
-        <w:t>2 Review design method and scope</w:t>
-      </w:r>
-    </w:p>
-    <w:p>
-      <w:r>
-        <w:rPr>
-          <w:b w:val="0"/>
-          <w:i w:val="0"/>
-        </w:rPr>
-        <w:t>Explain the review's purpose, audience, boundaries, search approach, selection criteria, and proposed organization. Distinguish an exploratory course review from any claim to have completed a systematic review. Include enough detail for a reader to understand how the collection was assembled.</w:t>
+        <w:t>5 Structured draft and signposting</w:t>
+      </w:r>
+    </w:p>
+    <w:p>
+      <w:r>
+        <w:rPr>
+          <w:b w:val="0"/>
+          <w:i w:val="0"/>
+        </w:rPr>
+        <w:t>Submit an outline and a developed draft section showing the review's organizing argument. Use headings, transitions, and metadiscourse to make relationships explicit. Explain one structural revision and how it improves the reader's understanding.</w:t>
       </w:r>
     </w:p>
     <w:p>
@@ -3424,16 +3499,16 @@
         <w:pStyle w:val="Heading2"/>
       </w:pPr>
       <w:r>
-        <w:t>3 Conceptual map of the literature</w:t>
-      </w:r>
-    </w:p>
-    <w:p>
-      <w:r>
-        <w:rPr>
-          <w:b w:val="0"/>
-          <w:i w:val="0"/>
-        </w:rPr>
-        <w:t>Represent the main concepts, debates, approaches, or historical developments in your field. Link important relationships to sources and identify uncertainties or omissions. Accompany the map with a short explanation of how it affects your question and search.</w:t>
+        <w:t>6 AI-use statement and reflexive commentary</w:t>
+      </w:r>
+    </w:p>
+    <w:p>
+      <w:r>
+        <w:rPr>
+          <w:b w:val="0"/>
+          <w:i w:val="0"/>
+        </w:rPr>
+        <w:t>Explain where AI influenced searching, reading, mapping, or writing; what you checked; what you rejected; and what responsibility you retained. Connect your position as a researcher to a specific choice in the review. Include selected examples where useful, without requiring publication of private conversations or irrelevant personal information.</w:t>
       </w:r>
     </w:p>
     <w:p>
@@ -3441,91 +3516,63 @@
         <w:pStyle w:val="Heading2"/>
       </w:pPr>
       <w:r>
-        <w:t>4 Literature review writing sample</w:t>
-      </w:r>
-    </w:p>
-    <w:p>
-      <w:r>
-        <w:rPr>
-          <w:b w:val="0"/>
-          <w:i w:val="0"/>
-        </w:rPr>
-        <w:t xml:space="preserve">Develop a section that synthesizes literature rather than describing articles one at a time. Compare scientific and humanities modes of framing or interpretation; explain which choices serve your question and audience. </w:t>
-      </w:r>
+        <w:t>7 Final literature review or course outline</w:t>
+      </w:r>
+    </w:p>
+    <w:p>
+      <w:r>
+        <w:rPr>
+          <w:b w:val="0"/>
+          <w:i w:val="0"/>
+        </w:rPr>
+        <w:t>Choose one of two forms. Both build on the staged work.</w:t>
+      </w:r>
+    </w:p>
+    <w:p>
+      <w:pPr>
+        <w:pStyle w:val="ListBullet"/>
+      </w:pPr>
       <w:r>
         <w:rPr>
           <w:b/>
           <w:i w:val="0"/>
-          <w:highlight w:val="yellow"/>
-        </w:rPr>
-        <w:t>[TO CONFIRM]</w:t>
-      </w:r>
-      <w:r>
-        <w:rPr>
-          <w:b w:val="0"/>
-          <w:i w:val="0"/>
-        </w:rPr>
-        <w:t xml:space="preserve"> Whether students submit two short versions or one version with commentary.</w:t>
-      </w:r>
-    </w:p>
-    <w:p>
-      <w:pPr>
-        <w:pStyle w:val="Heading2"/>
-      </w:pPr>
-      <w:r>
-        <w:t>5 Structured draft and signposting</w:t>
-      </w:r>
-    </w:p>
-    <w:p>
-      <w:r>
-        <w:rPr>
-          <w:b w:val="0"/>
-          <w:i w:val="0"/>
-        </w:rPr>
-        <w:t>Submit an outline and a developed draft section showing the review's organizing argument. Use headings, transitions, and metadiscourse to make relationships explicit. Explain one structural revision and how it improves the reader's understanding.</w:t>
-      </w:r>
-    </w:p>
-    <w:p>
-      <w:pPr>
-        <w:pStyle w:val="Heading2"/>
-      </w:pPr>
-      <w:r>
-        <w:t>6 AI-use statement and reflexive commentary</w:t>
-      </w:r>
-    </w:p>
-    <w:p>
-      <w:r>
-        <w:rPr>
-          <w:b w:val="0"/>
-          <w:i w:val="0"/>
-        </w:rPr>
-        <w:t>Explain where AI influenced searching, reading, mapping, or writing; what you checked; what you rejected; and what responsibility you retained. Connect your position as a researcher to a specific choice in the review. Include selected examples where useful, without requiring publication of private conversations or irrelevant personal information.</w:t>
-      </w:r>
-    </w:p>
-    <w:p>
-      <w:pPr>
-        <w:pStyle w:val="Heading2"/>
-      </w:pPr>
-      <w:r>
-        <w:t>7 Final literature review</w:t>
-      </w:r>
-    </w:p>
-    <w:p>
-      <w:r>
-        <w:rPr>
-          <w:b w:val="0"/>
-          <w:i w:val="0"/>
-        </w:rPr>
-        <w:t>Submit a coherent review that develops a defensible contribution from the staged work. It should establish a question and scope, synthesize relevant literature, explain relationships and disagreements, and identify a plausible gap or a different way to frame the problem.</w:t>
-      </w:r>
-    </w:p>
-    <w:p>
-      <w:r>
-        <w:rPr>
-          <w:b w:val="0"/>
-          <w:i w:val="0"/>
-        </w:rPr>
-        <w:t xml:space="preserve">The final literature review is 1,500–2,000 words. Include an AI-use statement and a short revision memo explaining how the review changed in response to evidence and feedback. </w:t>
+        </w:rPr>
+        <w:t>Option A: a literature review.</w:t>
+      </w:r>
+      <w:r>
+        <w:rPr>
+          <w:b w:val="0"/>
+          <w:i w:val="0"/>
+        </w:rPr>
+        <w:t xml:space="preserve"> Submit a coherent review that develops a defensible contribution from the staged work. It should establish a question and scope, synthesize relevant literature, explain relationships and disagreements, and identify a plausible gap or a different way to frame the problem.</w:t>
+      </w:r>
+    </w:p>
+    <w:p>
+      <w:pPr>
+        <w:pStyle w:val="ListBullet"/>
+      </w:pPr>
+      <w:r>
+        <w:rPr>
+          <w:b/>
+          <w:i w:val="0"/>
+        </w:rPr>
+        <w:t>Option B: a course outline for teaching how to write a literature review.</w:t>
+      </w:r>
+      <w:r>
+        <w:rPr>
+          <w:b w:val="0"/>
+          <w:i w:val="0"/>
+        </w:rPr>
+        <w:t xml:space="preserve"> Design a short course or module that teaches a specific audience to write a literature review in your field. Set out each session's aim, readings, activities and how learning is checked. Justify the design with the course readings and wider literature, including where AI belongs in the process and where it does not. Like a review, the outline needs a clear scope, sources that support its choices, and an argument for why the sequence works.</w:t>
+      </w:r>
+    </w:p>
+    <w:p>
+      <w:r>
+        <w:rPr>
+          <w:b w:val="0"/>
+          <w:i w:val="0"/>
+        </w:rPr>
+        <w:t xml:space="preserve">Either option is 1,500–2,000 words. Include an AI-use statement and a short revision memo explaining how the review changed in response to evidence and feedback. </w:t>
       </w:r>
       <w:r>
         <w:rPr>
@@ -4835,12 +4882,43 @@
           <w:b w:val="0"/>
           <w:i w:val="0"/>
         </w:rPr>
-        <w:t xml:space="preserve"> Participate in the scheduled seminars and collaborative activities. If you must miss a session, contact me to arrange an equivalent way to engage with the work. </w:t>
-      </w:r>
+        <w:t xml:space="preserve"> I hope you can join every seminar, because the discussion and workshops are where much of the learning happens. I also know that graduate students balance work, family, health and other commitments. Attendance is not graded, and you do not need to explain or document an absence. If you miss a seminar, catch up from the slides and Canvas materials, and contact me if you would like to talk through that week's task. Absences covered by the </w:t>
+      </w:r>
+      <w:hyperlink r:id="rId61">
+        <w:r>
+          <w:rPr>
+            <w:u w:val="single"/>
+          </w:rPr>
+          <w:t>Student Code</w:t>
+        </w:r>
+      </w:hyperlink>
+      <w:r>
+        <w:rPr>
+          <w:b w:val="0"/>
+          <w:i w:val="0"/>
+        </w:rPr>
+        <w:t>, including religious observances, will always be accommodated.</w:t>
+      </w:r>
+    </w:p>
+    <w:p>
       <w:r>
         <w:rPr>
           <w:b/>
           <w:i w:val="0"/>
+        </w:rPr>
+        <w:t>Late work.</w:t>
+      </w:r>
+      <w:r>
+        <w:rPr>
+          <w:b w:val="0"/>
+          <w:i w:val="0"/>
+        </w:rPr>
+        <w:t xml:space="preserve"> Contact me early if a deadline creates a problem. Staged tasks support later work, so an extension should include a realistic plan for catching up. </w:t>
+      </w:r>
+      <w:r>
+        <w:rPr>
+          <w:b/>
+          <w:i w:val="0"/>
           <w:highlight w:val="yellow"/>
         </w:rPr>
         <w:t>[TO CONFIRM]</w:t>
@@ -4850,59 +4928,28 @@
           <w:b w:val="0"/>
           <w:i w:val="0"/>
         </w:rPr>
-        <w:t xml:space="preserve"> Attendance and participation requirements.</w:t>
-      </w:r>
-    </w:p>
-    <w:p>
+        <w:t xml:space="preserve"> Any penalties, extension procedure, and the final submission cutoff. The Registrar lists the faculty grade-reporting deadline as </w:t>
+      </w:r>
       <w:r>
         <w:rPr>
           <w:b/>
           <w:i w:val="0"/>
         </w:rPr>
-        <w:t>Late work.</w:t>
-      </w:r>
-      <w:r>
-        <w:rPr>
-          <w:b w:val="0"/>
-          <w:i w:val="0"/>
-        </w:rPr>
-        <w:t xml:space="preserve"> Contact me early if a deadline creates a problem. Staged tasks support later work, so an extension should include a realistic plan for catching up. </w:t>
-      </w:r>
+        <w:t>22 December 2026 at 2:00 PM</w:t>
+      </w:r>
+      <w:r>
+        <w:rPr>
+          <w:b w:val="0"/>
+          <w:i w:val="0"/>
+        </w:rPr>
+        <w:t>; this is an instructor deadline, not a student submission date.</w:t>
+      </w:r>
+    </w:p>
+    <w:p>
       <w:r>
         <w:rPr>
           <w:b/>
           <w:i w:val="0"/>
-          <w:highlight w:val="yellow"/>
-        </w:rPr>
-        <w:t>[TO CONFIRM]</w:t>
-      </w:r>
-      <w:r>
-        <w:rPr>
-          <w:b w:val="0"/>
-          <w:i w:val="0"/>
-        </w:rPr>
-        <w:t xml:space="preserve"> Any penalties, extension procedure, and the final submission cutoff. The Registrar lists the faculty grade-reporting deadline as </w:t>
-      </w:r>
-      <w:r>
-        <w:rPr>
-          <w:b/>
-          <w:i w:val="0"/>
-        </w:rPr>
-        <w:t>22 December 2026 at 2:00 PM</w:t>
-      </w:r>
-      <w:r>
-        <w:rPr>
-          <w:b w:val="0"/>
-          <w:i w:val="0"/>
-        </w:rPr>
-        <w:t>; this is an instructor deadline, not a student submission date.</w:t>
-      </w:r>
-    </w:p>
-    <w:p>
-      <w:r>
-        <w:rPr>
-          <w:b/>
-          <w:i w:val="0"/>
         </w:rPr>
         <w:t>Accessibility.</w:t>
       </w:r>
@@ -4913,7 +4960,7 @@
         </w:rPr>
         <w:t xml:space="preserve"> Contact the instructor about access needs and consult </w:t>
       </w:r>
-      <w:hyperlink r:id="rId59">
+      <w:hyperlink r:id="rId62">
         <w:r>
           <w:rPr>
             <w:u w:val="single"/>
@@ -4990,7 +5037,7 @@
         </w:rPr>
         <w:t xml:space="preserve"> The </w:t>
       </w:r>
-      <w:hyperlink r:id="rId60">
+      <w:hyperlink r:id="rId63">
         <w:r>
           <w:rPr>
             <w:u w:val="single"/>
@@ -5036,7 +5083,7 @@
         </w:rPr>
         <w:t xml:space="preserve"> Support information is available through the </w:t>
       </w:r>
-      <w:hyperlink r:id="rId61">
+      <w:hyperlink r:id="rId64">
         <w:r>
           <w:rPr>
             <w:u w:val="single"/>
@@ -6705,7 +6752,7 @@
                 <w:i w:val="0"/>
                 <w:sz w:val="19"/>
               </w:rPr>
-              <w:t>Revision memo and AI-use statement accompany the review</w:t>
+              <w:t>Revision memo and AI-use statement accompany the submission</w:t>
             </w:r>
           </w:p>
         </w:tc>
@@ -6736,7 +6783,7 @@
                 <w:i w:val="0"/>
                 <w:sz w:val="19"/>
               </w:rPr>
-              <w:t>Final literature review, 40%</w:t>
+              <w:t>Final review or course outline, 40%</w:t>
             </w:r>
           </w:p>
         </w:tc>
@@ -6892,7 +6939,7 @@
         </w:rPr>
         <w:t xml:space="preserve">Structure adapted from </w:t>
       </w:r>
-      <w:hyperlink r:id="rId62">
+      <w:hyperlink r:id="rId65">
         <w:r>
           <w:rPr>
             <w:u w:val="single"/>
@@ -6907,7 +6954,7 @@
         </w:rPr>
         <w:t xml:space="preserve">. Course content and starting weights come from the </w:t>
       </w:r>
-      <w:hyperlink r:id="rId63">
+      <w:hyperlink r:id="rId66">
         <w:r>
           <w:rPr>
             <w:u w:val="single"/>
@@ -6931,7 +6978,7 @@
         </w:rPr>
         <w:t xml:space="preserve">Official calendar anchors: </w:t>
       </w:r>
-      <w:hyperlink r:id="rId64">
+      <w:hyperlink r:id="rId67">
         <w:r>
           <w:rPr>
             <w:u w:val="single"/>

</xml_diff>

<commit_message>
590 syllabus: University statements, resolved TO CONFIRMs, Task 7 rubric draft
- University policies and resources: academic integrity, DRES, religious
  observances, Community of Care, mental health (988), Title IX reporting,
  BART, FERPA, disruptive behavior, emergency response
- Catalog listing (Advanced Graduate Seminar, section AIL), Zoom via the
  Canvas menu, workload 20-25 h/week, record keeping, readings access,
  class Google Doc, available AI tools, Task 4 format, Task 7 citation /
  format / memo, rubric note, peer-review assignment, AI policy
- Remaining TO CONFIRM: Sessions 5-7 readings, grading scale and rounding,
  late work, recording
- _drafts/task-7-rubric.md for review

Co-Authored-By: Claude Opus 5.5 <noreply@anthropic.com>
</commit_message>
<xml_diff>
--- a/courses/590-fall-2026/syllabus/University-of-Illinois-Urbana-Champaign-Syllabus-590-Fall-2026-Draft.docx
+++ b/courses/590-fall-2026/syllabus/University-of-Illinois-Urbana-Champaign-Syllabus-590-Fall-2026-Draft.docx
@@ -349,16 +349,15 @@
                 <w:i w:val="0"/>
                 <w:sz w:val="20"/>
               </w:rPr>
-              <w:t xml:space="preserve">Online via Zoom. </w:t>
+              <w:t xml:space="preserve">Online via Zoom: join from </w:t>
             </w:r>
             <w:r>
               <w:rPr>
                 <w:b/>
                 <w:i w:val="0"/>
                 <w:sz w:val="20"/>
-                <w:highlight w:val="yellow"/>
-              </w:rPr>
-              <w:t>[TO CONFIRM]</w:t>
+              </w:rPr>
+              <w:t>Zoom Meeting</w:t>
             </w:r>
             <w:r>
               <w:rPr>
@@ -366,7 +365,7 @@
                 <w:i w:val="0"/>
                 <w:sz w:val="20"/>
               </w:rPr>
-              <w:t xml:space="preserve"> Meeting link; access information on Canvas</w:t>
+              <w:t xml:space="preserve"> in the Canvas course menu</w:t>
             </w:r>
           </w:p>
         </w:tc>
@@ -752,16 +751,29 @@
         <w:rPr>
           <w:b/>
           <w:i w:val="0"/>
-          <w:highlight w:val="yellow"/>
-        </w:rPr>
-        <w:t>[TO CONFIRM]</w:t>
-      </w:r>
-      <w:r>
-        <w:rPr>
-          <w:b w:val="0"/>
-          <w:i w:val="0"/>
-        </w:rPr>
-        <w:t xml:space="preserve"> Insert the official catalog description and any formal prerequisites. The description above is the working course description.</w:t>
+        </w:rPr>
+        <w:t>Catalog listing.</w:t>
+      </w:r>
+      <w:r>
+        <w:rPr>
+          <w:b w:val="0"/>
+          <w:i w:val="0"/>
+        </w:rPr>
+        <w:t xml:space="preserve"> EPOL 590 is listed as </w:t>
+      </w:r>
+      <w:r>
+        <w:rPr>
+          <w:b w:val="0"/>
+          <w:i/>
+        </w:rPr>
+        <w:t>Advanced Graduate Seminar</w:t>
+      </w:r>
+      <w:r>
+        <w:rPr>
+          <w:b w:val="0"/>
+          <w:i w:val="0"/>
+        </w:rPr>
+        <w:t xml:space="preserve"> (0–4 hours; may be repeated to a maximum of 12 hours if topics vary). This section, AIL, is restricted to graduate students at Urbana-Champaign. Its catalog description: “This course aims to make sense of a term – academic literature – at once mundane and mystical. It starts with fundamentals: how to build, annotate, analyze, map and translate a literature database into a literature review. It progresses to think about how AI and other technology can help foster more critical, analytic and reflexive modes of interpretation and understandings of the field.”</w:t>
       </w:r>
     </w:p>
     <w:p>
@@ -1084,22 +1096,7 @@
           <w:b w:val="0"/>
           <w:i w:val="0"/>
         </w:rPr>
-        <w:t xml:space="preserve">No book purchase is required. Readings will be posted on Canvas under each session's module. </w:t>
-      </w:r>
-      <w:r>
-        <w:rPr>
-          <w:b/>
-          <w:i w:val="0"/>
-          <w:highlight w:val="yellow"/>
-        </w:rPr>
-        <w:t>[TO CONFIRM]</w:t>
-      </w:r>
-      <w:r>
-        <w:rPr>
-          <w:b w:val="0"/>
-          <w:i w:val="0"/>
-        </w:rPr>
-        <w:t xml:space="preserve"> The final reading list, editions, excerpts, and student access.</w:t>
+        <w:t>No book purchase is required. Readings are linked or posted on Canvas under each session’s module, with University Library links where available.</w:t>
       </w:r>
     </w:p>
     <w:p>
@@ -1414,109 +1411,92 @@
           <w:b w:val="0"/>
           <w:i w:val="0"/>
         </w:rPr>
-        <w:t xml:space="preserve"> carries announcements, materials, assignment instructions, submissions, grades, and private instructor comments. A running document may be used for drafting and collaboration. </w:t>
+        <w:t xml:space="preserve"> carries announcements, materials, assignment instructions, submissions, grades, and private instructor comments. A shared class Google Doc, </w:t>
+      </w:r>
+      <w:r>
+        <w:rPr>
+          <w:b w:val="0"/>
+          <w:i/>
+        </w:rPr>
+        <w:t>EPOL 590 Fall 2026</w:t>
+      </w:r>
+      <w:r>
+        <w:rPr>
+          <w:b w:val="0"/>
+          <w:i w:val="0"/>
+        </w:rPr>
+        <w:t>, is used for in-seminar drafting and collaboration; it is linked on Canvas and shared only with the class.</w:t>
+      </w:r>
+    </w:p>
+    <w:p>
+      <w:r>
+        <w:rPr>
+          <w:b w:val="0"/>
+          <w:i w:val="0"/>
+        </w:rPr>
+        <w:t xml:space="preserve">Use a reference manager or another reliable way to retain full citations and notes. AI-supported exercises are part of the seminar design. The </w:t>
       </w:r>
       <w:r>
         <w:rPr>
           <w:b/>
           <w:i w:val="0"/>
-          <w:highlight w:val="yellow"/>
-        </w:rPr>
-        <w:t>[TO CONFIRM]</w:t>
-      </w:r>
-      <w:r>
-        <w:rPr>
-          <w:b w:val="0"/>
-          <w:i w:val="0"/>
-        </w:rPr>
-        <w:t xml:space="preserve"> Create a new class workspace; do not reuse last year's shared document.</w:t>
-      </w:r>
-    </w:p>
-    <w:p>
-      <w:r>
-        <w:rPr>
-          <w:b w:val="0"/>
-          <w:i w:val="0"/>
-        </w:rPr>
-        <w:t xml:space="preserve">Use a reference manager or another reliable way to retain full citations and notes. AI-supported exercises are part of the proposed seminar design. </w:t>
+        </w:rPr>
+        <w:t>AI Tools — 2026 Overview</w:t>
+      </w:r>
+      <w:r>
+        <w:rPr>
+          <w:b w:val="0"/>
+          <w:i w:val="0"/>
+        </w:rPr>
+        <w:t xml:space="preserve"> page on Canvas lists the tools the University provides; Copilot Chat, Gemini and NotebookLM are free to students. No paid AI subscription is required. If a tool creates a barrier of access, cost, privacy or accessibility, tell me and we will find an equivalent.</w:t>
+      </w:r>
+    </w:p>
+    <w:p>
+      <w:r>
+        <w:rPr>
+          <w:b w:val="0"/>
+          <w:i w:val="0"/>
+        </w:rPr>
+        <w:t>Do not put confidential, identifiable, or restricted material into an AI service. Use public or appropriately permitted materials for experiments and check the relevant institutional guidance before using research data.</w:t>
+      </w:r>
+    </w:p>
+    <w:p>
+      <w:pPr>
+        <w:pStyle w:val="Heading1"/>
+      </w:pPr>
+      <w:r>
+        <w:t>Course Requirements and Policies</w:t>
+      </w:r>
+    </w:p>
+    <w:p>
+      <w:pPr>
+        <w:pStyle w:val="Heading2"/>
+      </w:pPr>
+      <w:r>
+        <w:t>What I Expect from You</w:t>
+      </w:r>
+    </w:p>
+    <w:p>
+      <w:r>
+        <w:rPr>
+          <w:b w:val="0"/>
+          <w:i w:val="0"/>
+        </w:rPr>
+        <w:t xml:space="preserve">For planning, allow approximately </w:t>
       </w:r>
       <w:r>
         <w:rPr>
           <w:b/>
           <w:i w:val="0"/>
-          <w:highlight w:val="yellow"/>
-        </w:rPr>
-        <w:t>[TO CONFIRM]</w:t>
-      </w:r>
-      <w:r>
-        <w:rPr>
-          <w:b w:val="0"/>
-          <w:i w:val="0"/>
-        </w:rPr>
-        <w:t xml:space="preserve"> Available tools and equivalent alternatives where access, cost, privacy, or accessibility would create a barrier. No paid AI subscription is required by this draft.</w:t>
-      </w:r>
-    </w:p>
-    <w:p>
-      <w:r>
-        <w:rPr>
-          <w:b w:val="0"/>
-          <w:i w:val="0"/>
-        </w:rPr>
-        <w:t>Do not put confidential, identifiable, or restricted material into an AI service. Use public or appropriately permitted materials for experiments and check the relevant institutional guidance before using research data.</w:t>
-      </w:r>
-    </w:p>
-    <w:p>
-      <w:pPr>
-        <w:pStyle w:val="Heading1"/>
-      </w:pPr>
-      <w:r>
-        <w:t>Course Requirements and Policies</w:t>
-      </w:r>
-    </w:p>
-    <w:p>
-      <w:pPr>
-        <w:pStyle w:val="Heading2"/>
-      </w:pPr>
-      <w:r>
-        <w:t>What I Expect from You</w:t>
-      </w:r>
-    </w:p>
-    <w:p>
-      <w:r>
-        <w:rPr>
-          <w:b w:val="0"/>
-          <w:i w:val="0"/>
-        </w:rPr>
-        <w:t xml:space="preserve">For planning, allow approximately </w:t>
-      </w:r>
-      <w:r>
-        <w:rPr>
-          <w:b/>
-          <w:i w:val="0"/>
-        </w:rPr>
-        <w:t>20 hours per active teaching week</w:t>
-      </w:r>
-      <w:r>
-        <w:rPr>
-          <w:b w:val="0"/>
-          <w:i w:val="0"/>
-        </w:rPr>
-        <w:t xml:space="preserve">, including the seminar. This is a proposed workload for the four-credit compressed format; </w:t>
-      </w:r>
-      <w:r>
-        <w:rPr>
-          <w:b/>
-          <w:i w:val="0"/>
-          <w:highlight w:val="yellow"/>
-        </w:rPr>
-        <w:t>[TO CONFIRM]</w:t>
-      </w:r>
-      <w:r>
-        <w:rPr>
-          <w:b w:val="0"/>
-          <w:i w:val="0"/>
-        </w:rPr>
-        <w:t xml:space="preserve"> the final credit and workload expectations.</w:t>
+        </w:rPr>
+        <w:t>20–25 hours per active teaching week</w:t>
+      </w:r>
+      <w:r>
+        <w:rPr>
+          <w:b w:val="0"/>
+          <w:i w:val="0"/>
+        </w:rPr>
+        <w:t>, including the seminar. Four credit hours correspond to roughly 180 hours of work across the term, spread over seven teaching weeks.</w:t>
       </w:r>
     </w:p>
     <w:tbl>
@@ -1956,22 +1936,7 @@
           <w:b w:val="0"/>
           <w:i w:val="0"/>
         </w:rPr>
-        <w:t xml:space="preserve">Keep a research record containing your question, search decisions, source notes, maps, drafts, feedback, and AI-use notes. The record should let you explain why the review changed. We will not require a particular commercial tool; </w:t>
-      </w:r>
-      <w:r>
-        <w:rPr>
-          <w:b/>
-          <w:i w:val="0"/>
-          <w:highlight w:val="yellow"/>
-        </w:rPr>
-        <w:t>[TO CONFIRM]</w:t>
-      </w:r>
-      <w:r>
-        <w:rPr>
-          <w:b w:val="0"/>
-          <w:i w:val="0"/>
-        </w:rPr>
-        <w:t xml:space="preserve"> the preferred document and reference-management arrangements.</w:t>
+        <w:t>Keep a research record containing your question, search decisions, source notes, maps, drafts, feedback, and AI-use notes. The record should let you explain why the review changed. We will not require a particular commercial tool. A Google Doc, Word file or notebook all work; a free reference manager such as Zotero makes citations much easier to keep.</w:t>
       </w:r>
     </w:p>
     <w:p>
@@ -3459,22 +3424,114 @@
           <w:b w:val="0"/>
           <w:i w:val="0"/>
         </w:rPr>
-        <w:t xml:space="preserve">Develop a section that synthesizes literature rather than describing articles one at a time. Compare scientific and humanities modes of framing or interpretation; explain which choices serve your question and audience. </w:t>
-      </w:r>
+        <w:t>Develop a section that synthesizes literature rather than describing articles one at a time. Compare scientific and humanities modes of framing or interpretation; explain which choices serve your question and audience. Submit one 250–400-word section with a few sentences of commentary on your choices of audience, voice and evidence.</w:t>
+      </w:r>
+    </w:p>
+    <w:p>
+      <w:pPr>
+        <w:pStyle w:val="Heading2"/>
+      </w:pPr>
+      <w:r>
+        <w:t>5 Structured draft and signposting</w:t>
+      </w:r>
+    </w:p>
+    <w:p>
+      <w:r>
+        <w:rPr>
+          <w:b w:val="0"/>
+          <w:i w:val="0"/>
+        </w:rPr>
+        <w:t>Submit an outline and a developed draft section showing the review's organizing argument. Use headings, transitions, and metadiscourse to make relationships explicit. Explain one structural revision and how it improves the reader's understanding.</w:t>
+      </w:r>
+    </w:p>
+    <w:p>
+      <w:pPr>
+        <w:pStyle w:val="Heading2"/>
+      </w:pPr>
+      <w:r>
+        <w:t>6 AI-use statement and reflexive commentary</w:t>
+      </w:r>
+    </w:p>
+    <w:p>
+      <w:r>
+        <w:rPr>
+          <w:b w:val="0"/>
+          <w:i w:val="0"/>
+        </w:rPr>
+        <w:t>Explain where AI influenced searching, reading, mapping, or writing; what you checked; what you rejected; and what responsibility you retained. Connect your position as a researcher to a specific choice in the review. Include selected examples where useful, without requiring publication of private conversations or irrelevant personal information.</w:t>
+      </w:r>
+    </w:p>
+    <w:p>
+      <w:pPr>
+        <w:pStyle w:val="Heading2"/>
+      </w:pPr>
+      <w:r>
+        <w:t>7 Final literature review or course outline</w:t>
+      </w:r>
+    </w:p>
+    <w:p>
+      <w:r>
+        <w:rPr>
+          <w:b w:val="0"/>
+          <w:i w:val="0"/>
+        </w:rPr>
+        <w:t>Choose one of two forms. Both build on the staged work.</w:t>
+      </w:r>
+    </w:p>
+    <w:p>
+      <w:pPr>
+        <w:pStyle w:val="ListBullet"/>
+      </w:pPr>
       <w:r>
         <w:rPr>
           <w:b/>
           <w:i w:val="0"/>
-          <w:highlight w:val="yellow"/>
-        </w:rPr>
-        <w:t>[TO CONFIRM]</w:t>
-      </w:r>
-      <w:r>
-        <w:rPr>
-          <w:b w:val="0"/>
-          <w:i w:val="0"/>
-        </w:rPr>
-        <w:t xml:space="preserve"> Whether students submit two short versions or one version with commentary.</w:t>
+        </w:rPr>
+        <w:t>Option A: a literature review.</w:t>
+      </w:r>
+      <w:r>
+        <w:rPr>
+          <w:b w:val="0"/>
+          <w:i w:val="0"/>
+        </w:rPr>
+        <w:t xml:space="preserve"> Submit a coherent review that develops a defensible contribution from the staged work. It should establish a question and scope, synthesize relevant literature, explain relationships and disagreements, and identify a plausible gap or a different way to frame the problem.</w:t>
+      </w:r>
+    </w:p>
+    <w:p>
+      <w:pPr>
+        <w:pStyle w:val="ListBullet"/>
+      </w:pPr>
+      <w:r>
+        <w:rPr>
+          <w:b/>
+          <w:i w:val="0"/>
+        </w:rPr>
+        <w:t>Option B: a course outline for teaching how to write a literature review.</w:t>
+      </w:r>
+      <w:r>
+        <w:rPr>
+          <w:b w:val="0"/>
+          <w:i w:val="0"/>
+        </w:rPr>
+        <w:t xml:space="preserve"> Design a short course or module that teaches a specific audience to write a literature review in your field. Set out each session's aim, readings, activities and how learning is checked. Justify the design with the course readings and wider literature, including where AI belongs in the process and where it does not. Like a review, the outline needs a clear scope, sources that support its choices, and an argument for why the sequence works.</w:t>
+      </w:r>
+    </w:p>
+    <w:p>
+      <w:r>
+        <w:rPr>
+          <w:b w:val="0"/>
+          <w:i w:val="0"/>
+        </w:rPr>
+        <w:t>Either option is 1,500–2,000 words. Include an AI-use statement and a short revision memo explaining how the review changed in response to evidence and feedback. Use one consistent author–date citation style (APA 7th edition unless your field uses another). Submit a Google Doc link or a file. The revision memo is 250–350 words. The rubric is on Canvas.</w:t>
+      </w:r>
+    </w:p>
+    <w:p>
+      <w:r>
+        <w:rPr>
+          <w:b w:val="0"/>
+          <w:i w:val="0"/>
+        </w:rPr>
+        <w:t>The final seminar is a workshop for this submission. Aim to arrive with a complete working draft. The confirmed 15 December deadline allows revision after that workshop.</w:t>
       </w:r>
     </w:p>
     <w:p>
@@ -3482,16 +3539,97 @@
         <w:pStyle w:val="Heading2"/>
       </w:pPr>
       <w:r>
-        <w:t>5 Structured draft and signposting</w:t>
-      </w:r>
-    </w:p>
-    <w:p>
-      <w:r>
-        <w:rPr>
-          <w:b w:val="0"/>
-          <w:i w:val="0"/>
-        </w:rPr>
-        <w:t>Submit an outline and a developed draft section showing the review's organizing argument. Use headings, transitions, and metadiscourse to make relationships explicit. Explain one structural revision and how it improves the reader's understanding.</w:t>
+        <w:t>Assessment criteria</w:t>
+      </w:r>
+    </w:p>
+    <w:p>
+      <w:r>
+        <w:rPr>
+          <w:b w:val="0"/>
+          <w:i w:val="0"/>
+        </w:rPr>
+        <w:t>The common criteria are:</w:t>
+      </w:r>
+    </w:p>
+    <w:p>
+      <w:pPr>
+        <w:pStyle w:val="ListBullet"/>
+      </w:pPr>
+      <w:r>
+        <w:rPr>
+          <w:b w:val="0"/>
+          <w:i w:val="0"/>
+        </w:rPr>
+        <w:t>significance and feasibility of the question;</w:t>
+      </w:r>
+    </w:p>
+    <w:p>
+      <w:pPr>
+        <w:pStyle w:val="ListBullet"/>
+      </w:pPr>
+      <w:r>
+        <w:rPr>
+          <w:b w:val="0"/>
+          <w:i w:val="0"/>
+        </w:rPr>
+        <w:t>relevance and traceability of sources;</w:t>
+      </w:r>
+    </w:p>
+    <w:p>
+      <w:pPr>
+        <w:pStyle w:val="ListBullet"/>
+      </w:pPr>
+      <w:r>
+        <w:rPr>
+          <w:b w:val="0"/>
+          <w:i w:val="0"/>
+        </w:rPr>
+        <w:t>quality of interpretation and synthesis;</w:t>
+      </w:r>
+    </w:p>
+    <w:p>
+      <w:pPr>
+        <w:pStyle w:val="ListBullet"/>
+      </w:pPr>
+      <w:r>
+        <w:rPr>
+          <w:b w:val="0"/>
+          <w:i w:val="0"/>
+        </w:rPr>
+        <w:t>clarity of organization, framing, and scholarly voice;</w:t>
+      </w:r>
+    </w:p>
+    <w:p>
+      <w:pPr>
+        <w:pStyle w:val="ListBullet"/>
+      </w:pPr>
+      <w:r>
+        <w:rPr>
+          <w:b w:val="0"/>
+          <w:i w:val="0"/>
+        </w:rPr>
+        <w:t>reflexivity and responsible, transparent AI use;</w:t>
+      </w:r>
+    </w:p>
+    <w:p>
+      <w:pPr>
+        <w:pStyle w:val="ListBullet"/>
+      </w:pPr>
+      <w:r>
+        <w:rPr>
+          <w:b w:val="0"/>
+          <w:i w:val="0"/>
+        </w:rPr>
+        <w:t>responsiveness to evidence and feedback.</w:t>
+      </w:r>
+    </w:p>
+    <w:p>
+      <w:r>
+        <w:rPr>
+          <w:b w:val="0"/>
+          <w:i w:val="0"/>
+        </w:rPr>
+        <w:t>The staged tasks emphasize development and reasoned decisions. The final review emphasizes how those decisions work together in the completed argument. Each task is marked on Canvas with a rubric built on these six criteria.</w:t>
       </w:r>
     </w:p>
     <w:p>
@@ -3499,16 +3637,25 @@
         <w:pStyle w:val="Heading2"/>
       </w:pPr>
       <w:r>
-        <w:t>6 AI-use statement and reflexive commentary</w:t>
-      </w:r>
-    </w:p>
-    <w:p>
-      <w:r>
-        <w:rPr>
-          <w:b w:val="0"/>
-          <w:i w:val="0"/>
-        </w:rPr>
-        <w:t>Explain where AI influenced searching, reading, mapping, or writing; what you checked; what you rejected; and what responsibility you retained. Connect your position as a researcher to a specific choice in the review. Include selected examples where useful, without requiring publication of private conversations or irrelevant personal information.</w:t>
+        <w:t>Peer commentary</w:t>
+      </w:r>
+    </w:p>
+    <w:p>
+      <w:r>
+        <w:rPr>
+          <w:b w:val="0"/>
+          <w:i w:val="0"/>
+        </w:rPr>
+        <w:t>Peer workshops run in Sessions 4 and 6, with instructor feedback on the map and structured draft. After you submit Tasks 4 and 6, Canvas assigns you classmates' submissions to review. Each peer review is worth 5%. It is graded complete or incomplete: complete means specific, constructive comments on each assigned submission by the review deadline (Friday 20 November for Task 4, Friday 11 December for Task 6). The Task 6 reviews arrive in time to help with the final review.</w:t>
+      </w:r>
+    </w:p>
+    <w:p>
+      <w:r>
+        <w:rPr>
+          <w:b w:val="0"/>
+          <w:i w:val="0"/>
+        </w:rPr>
+        <w:t>Share only the material needed for the exercise. Use named recipients and institution-supported arrangements. Students may use an anonymized extract or an instructor-mediated alternative. Keep grades and private instructor comments in Canvas. Canvas assigns each student two classmates’ submissions once the task’s deadline passes. If you would rather not share your draft, tell me before the deadline and we will use an anonymized extract or route the exchange through me.</w:t>
       </w:r>
     </w:p>
     <w:p>
@@ -3516,16 +3663,16 @@
         <w:pStyle w:val="Heading2"/>
       </w:pPr>
       <w:r>
-        <w:t>7 Final literature review or course outline</w:t>
-      </w:r>
-    </w:p>
-    <w:p>
-      <w:r>
-        <w:rPr>
-          <w:b w:val="0"/>
-          <w:i w:val="0"/>
-        </w:rPr>
-        <w:t>Choose one of two forms. Both build on the staged work.</w:t>
+        <w:t>Use of AI in this course</w:t>
+      </w:r>
+    </w:p>
+    <w:p>
+      <w:r>
+        <w:rPr>
+          <w:b w:val="0"/>
+          <w:i w:val="0"/>
+        </w:rPr>
+        <w:t>AI is an object of study and a possible research tool. Use it in ways that make your own judgment more visible.</w:t>
       </w:r>
     </w:p>
     <w:p>
@@ -3534,324 +3681,81 @@
       </w:pPr>
       <w:r>
         <w:rPr>
+          <w:b w:val="0"/>
+          <w:i w:val="0"/>
+        </w:rPr>
+        <w:t>Explore interpretations, test arguments, compare organizational choices, and generate search leads.</w:t>
+      </w:r>
+    </w:p>
+    <w:p>
+      <w:pPr>
+        <w:pStyle w:val="ListBullet"/>
+      </w:pPr>
+      <w:r>
+        <w:rPr>
+          <w:b w:val="0"/>
+          <w:i w:val="0"/>
+        </w:rPr>
+        <w:t>Verify citations against the actual source. Read enough to establish what the source supports.</w:t>
+      </w:r>
+    </w:p>
+    <w:p>
+      <w:pPr>
+        <w:pStyle w:val="ListBullet"/>
+      </w:pPr>
+      <w:r>
+        <w:rPr>
+          <w:b w:val="0"/>
+          <w:i w:val="0"/>
+        </w:rPr>
+        <w:t>Describe consequential AI use in each submission; retain selected examples of useful outputs and errors.</w:t>
+      </w:r>
+    </w:p>
+    <w:p>
+      <w:pPr>
+        <w:pStyle w:val="ListBullet"/>
+      </w:pPr>
+      <w:r>
+        <w:rPr>
+          <w:b w:val="0"/>
+          <w:i w:val="0"/>
+        </w:rPr>
+        <w:t>Distinguish the author's claim, your interpretation, and an AI-generated suggestion.</w:t>
+      </w:r>
+    </w:p>
+    <w:p>
+      <w:pPr>
+        <w:pStyle w:val="ListBullet"/>
+      </w:pPr>
+      <w:r>
+        <w:rPr>
+          <w:b w:val="0"/>
+          <w:i w:val="0"/>
+        </w:rPr>
+        <w:t>Do not present fabricated references, unverified quotations, or generated analysis you cannot explain as established scholarship.</w:t>
+      </w:r>
+    </w:p>
+    <w:p>
+      <w:r>
+        <w:rPr>
+          <w:b w:val="0"/>
+          <w:i w:val="0"/>
+        </w:rPr>
+        <w:t xml:space="preserve">A polished output is not sufficient evidence of learning. Be prepared to explain why a source belongs in the review, how a claim follows from it, and what you changed. This section is the course AI policy. The University’s academic-integrity rules also apply; see </w:t>
+      </w:r>
+      <w:r>
+        <w:rPr>
           <w:b/>
           <w:i w:val="0"/>
         </w:rPr>
-        <w:t>Option A: a literature review.</w:t>
-      </w:r>
-      <w:r>
-        <w:rPr>
-          <w:b w:val="0"/>
-          <w:i w:val="0"/>
-        </w:rPr>
-        <w:t xml:space="preserve"> Submit a coherent review that develops a defensible contribution from the staged work. It should establish a question and scope, synthesize relevant literature, explain relationships and disagreements, and identify a plausible gap or a different way to frame the problem.</w:t>
-      </w:r>
-    </w:p>
-    <w:p>
-      <w:pPr>
-        <w:pStyle w:val="ListBullet"/>
-      </w:pPr>
-      <w:r>
-        <w:rPr>
-          <w:b/>
-          <w:i w:val="0"/>
-        </w:rPr>
-        <w:t>Option B: a course outline for teaching how to write a literature review.</w:t>
-      </w:r>
-      <w:r>
-        <w:rPr>
-          <w:b w:val="0"/>
-          <w:i w:val="0"/>
-        </w:rPr>
-        <w:t xml:space="preserve"> Design a short course or module that teaches a specific audience to write a literature review in your field. Set out each session's aim, readings, activities and how learning is checked. Justify the design with the course readings and wider literature, including where AI belongs in the process and where it does not. Like a review, the outline needs a clear scope, sources that support its choices, and an argument for why the sequence works.</w:t>
-      </w:r>
-    </w:p>
-    <w:p>
-      <w:r>
-        <w:rPr>
-          <w:b w:val="0"/>
-          <w:i w:val="0"/>
-        </w:rPr>
-        <w:t xml:space="preserve">Either option is 1,500–2,000 words. Include an AI-use statement and a short revision memo explaining how the review changed in response to evidence and feedback. </w:t>
-      </w:r>
-      <w:r>
-        <w:rPr>
-          <w:b/>
-          <w:i w:val="0"/>
-          <w:highlight w:val="yellow"/>
-        </w:rPr>
-        <w:t>[TO CONFIRM]</w:t>
-      </w:r>
-      <w:r>
-        <w:rPr>
-          <w:b w:val="0"/>
-          <w:i w:val="0"/>
-        </w:rPr>
-        <w:t xml:space="preserve"> Citation expectations, submission format, memo length, and the detailed rubric.</w:t>
-      </w:r>
-    </w:p>
-    <w:p>
-      <w:r>
-        <w:rPr>
-          <w:b w:val="0"/>
-          <w:i w:val="0"/>
-        </w:rPr>
-        <w:t>The final seminar is a workshop for this submission. Aim to arrive with a complete working draft. The confirmed 15 December deadline allows revision after that workshop.</w:t>
-      </w:r>
-    </w:p>
-    <w:p>
-      <w:pPr>
-        <w:pStyle w:val="Heading2"/>
-      </w:pPr>
-      <w:r>
-        <w:t>Assessment criteria</w:t>
-      </w:r>
-    </w:p>
-    <w:p>
-      <w:r>
-        <w:rPr>
-          <w:b w:val="0"/>
-          <w:i w:val="0"/>
-        </w:rPr>
-        <w:t>The common criteria are:</w:t>
-      </w:r>
-    </w:p>
-    <w:p>
-      <w:pPr>
-        <w:pStyle w:val="ListBullet"/>
-      </w:pPr>
-      <w:r>
-        <w:rPr>
-          <w:b w:val="0"/>
-          <w:i w:val="0"/>
-        </w:rPr>
-        <w:t>significance and feasibility of the question;</w:t>
-      </w:r>
-    </w:p>
-    <w:p>
-      <w:pPr>
-        <w:pStyle w:val="ListBullet"/>
-      </w:pPr>
-      <w:r>
-        <w:rPr>
-          <w:b w:val="0"/>
-          <w:i w:val="0"/>
-        </w:rPr>
-        <w:t>relevance and traceability of sources;</w:t>
-      </w:r>
-    </w:p>
-    <w:p>
-      <w:pPr>
-        <w:pStyle w:val="ListBullet"/>
-      </w:pPr>
-      <w:r>
-        <w:rPr>
-          <w:b w:val="0"/>
-          <w:i w:val="0"/>
-        </w:rPr>
-        <w:t>quality of interpretation and synthesis;</w:t>
-      </w:r>
-    </w:p>
-    <w:p>
-      <w:pPr>
-        <w:pStyle w:val="ListBullet"/>
-      </w:pPr>
-      <w:r>
-        <w:rPr>
-          <w:b w:val="0"/>
-          <w:i w:val="0"/>
-        </w:rPr>
-        <w:t>clarity of organization, framing, and scholarly voice;</w:t>
-      </w:r>
-    </w:p>
-    <w:p>
-      <w:pPr>
-        <w:pStyle w:val="ListBullet"/>
-      </w:pPr>
-      <w:r>
-        <w:rPr>
-          <w:b w:val="0"/>
-          <w:i w:val="0"/>
-        </w:rPr>
-        <w:t>reflexivity and responsible, transparent AI use;</w:t>
-      </w:r>
-    </w:p>
-    <w:p>
-      <w:pPr>
-        <w:pStyle w:val="ListBullet"/>
-      </w:pPr>
-      <w:r>
-        <w:rPr>
-          <w:b w:val="0"/>
-          <w:i w:val="0"/>
-        </w:rPr>
-        <w:t>responsiveness to evidence and feedback.</w:t>
-      </w:r>
-    </w:p>
-    <w:p>
-      <w:r>
-        <w:rPr>
-          <w:b w:val="0"/>
-          <w:i w:val="0"/>
-        </w:rPr>
-        <w:t xml:space="preserve">The staged tasks emphasize development and reasoned decisions. The final review emphasizes how those decisions work together in the completed argument. </w:t>
-      </w:r>
-      <w:r>
-        <w:rPr>
-          <w:b/>
-          <w:i w:val="0"/>
-          <w:highlight w:val="yellow"/>
-        </w:rPr>
-        <w:t>[TO CONFIRM]</w:t>
-      </w:r>
-      <w:r>
-        <w:rPr>
-          <w:b w:val="0"/>
-          <w:i w:val="0"/>
-        </w:rPr>
-        <w:t xml:space="preserve"> Task-specific descriptors and allocation of marks.</w:t>
-      </w:r>
-    </w:p>
-    <w:p>
-      <w:pPr>
-        <w:pStyle w:val="Heading2"/>
-      </w:pPr>
-      <w:r>
-        <w:t>Peer commentary</w:t>
-      </w:r>
-    </w:p>
-    <w:p>
-      <w:r>
-        <w:rPr>
-          <w:b w:val="0"/>
-          <w:i w:val="0"/>
-        </w:rPr>
-        <w:t>Peer workshops run in Sessions 4 and 6, with instructor feedback on the map and structured draft. After you submit Tasks 4 and 6, Canvas assigns you classmates' submissions to review. Each peer review is worth 5%. It is graded complete or incomplete: complete means specific, constructive comments on each assigned submission by the review deadline (Friday 20 November for Task 4, Friday 11 December for Task 6). The Task 6 reviews arrive in time to help with the final review.</w:t>
-      </w:r>
-    </w:p>
-    <w:p>
-      <w:r>
-        <w:rPr>
-          <w:b w:val="0"/>
-          <w:i w:val="0"/>
-        </w:rPr>
-        <w:t xml:space="preserve">Share only the material needed for the exercise. Use named recipients and institution-supported arrangements. Students may use an anonymized extract or an instructor-mediated alternative. Keep grades and private instructor comments in Canvas. </w:t>
-      </w:r>
-      <w:r>
-        <w:rPr>
-          <w:b/>
-          <w:i w:val="0"/>
-          <w:highlight w:val="yellow"/>
-        </w:rPr>
-        <w:t>[TO CONFIRM]</w:t>
-      </w:r>
-      <w:r>
-        <w:rPr>
-          <w:b w:val="0"/>
-          <w:i w:val="0"/>
-        </w:rPr>
-        <w:t xml:space="preserve"> Pairing, access arrangements, and an accessible alternative before the first workshop.</w:t>
-      </w:r>
-    </w:p>
-    <w:p>
-      <w:pPr>
-        <w:pStyle w:val="Heading2"/>
-      </w:pPr>
-      <w:r>
-        <w:t>Use of AI in this course</w:t>
-      </w:r>
-    </w:p>
-    <w:p>
-      <w:r>
-        <w:rPr>
-          <w:b w:val="0"/>
-          <w:i w:val="0"/>
-        </w:rPr>
-        <w:t>AI is an object of study and a possible research tool. Use it in ways that make your own judgment more visible.</w:t>
-      </w:r>
-    </w:p>
-    <w:p>
-      <w:pPr>
-        <w:pStyle w:val="ListBullet"/>
-      </w:pPr>
-      <w:r>
-        <w:rPr>
-          <w:b w:val="0"/>
-          <w:i w:val="0"/>
-        </w:rPr>
-        <w:t>Explore interpretations, test arguments, compare organizational choices, and generate search leads.</w:t>
-      </w:r>
-    </w:p>
-    <w:p>
-      <w:pPr>
-        <w:pStyle w:val="ListBullet"/>
-      </w:pPr>
-      <w:r>
-        <w:rPr>
-          <w:b w:val="0"/>
-          <w:i w:val="0"/>
-        </w:rPr>
-        <w:t>Verify citations against the actual source. Read enough to establish what the source supports.</w:t>
-      </w:r>
-    </w:p>
-    <w:p>
-      <w:pPr>
-        <w:pStyle w:val="ListBullet"/>
-      </w:pPr>
-      <w:r>
-        <w:rPr>
-          <w:b w:val="0"/>
-          <w:i w:val="0"/>
-        </w:rPr>
-        <w:t>Describe consequential AI use in each submission; retain selected examples of useful outputs and errors.</w:t>
-      </w:r>
-    </w:p>
-    <w:p>
-      <w:pPr>
-        <w:pStyle w:val="ListBullet"/>
-      </w:pPr>
-      <w:r>
-        <w:rPr>
-          <w:b w:val="0"/>
-          <w:i w:val="0"/>
-        </w:rPr>
-        <w:t>Distinguish the author's claim, your interpretation, and an AI-generated suggestion.</w:t>
-      </w:r>
-    </w:p>
-    <w:p>
-      <w:pPr>
-        <w:pStyle w:val="ListBullet"/>
-      </w:pPr>
-      <w:r>
-        <w:rPr>
-          <w:b w:val="0"/>
-          <w:i w:val="0"/>
-        </w:rPr>
-        <w:t>Do not present fabricated references, unverified quotations, or generated analysis you cannot explain as established scholarship.</w:t>
-      </w:r>
-    </w:p>
-    <w:p>
-      <w:r>
-        <w:rPr>
-          <w:b w:val="0"/>
-          <w:i w:val="0"/>
-        </w:rPr>
-        <w:t xml:space="preserve">A polished output is not sufficient evidence of learning. Be prepared to explain why a source belongs in the review, how a claim follows from it, and what you changed. </w:t>
-      </w:r>
-      <w:r>
-        <w:rPr>
-          <w:b/>
-          <w:i w:val="0"/>
-          <w:highlight w:val="yellow"/>
-        </w:rPr>
-        <w:t>[TO CONFIRM]</w:t>
-      </w:r>
-      <w:r>
-        <w:rPr>
-          <w:b w:val="0"/>
-          <w:i w:val="0"/>
-        </w:rPr>
-        <w:t xml:space="preserve"> Final course AI policy and current University academic-integrity wording.</w:t>
+        <w:t>Academic integrity</w:t>
+      </w:r>
+      <w:r>
+        <w:rPr>
+          <w:b w:val="0"/>
+          <w:i w:val="0"/>
+        </w:rPr>
+        <w:t xml:space="preserve"> under Policies.</w:t>
       </w:r>
     </w:p>
     <w:p>
@@ -4951,29 +4855,14 @@
           <w:b/>
           <w:i w:val="0"/>
         </w:rPr>
-        <w:t>Accessibility.</w:t>
-      </w:r>
-      <w:r>
-        <w:rPr>
-          <w:b w:val="0"/>
-          <w:i w:val="0"/>
-        </w:rPr>
-        <w:t xml:space="preserve"> Contact the instructor about access needs and consult </w:t>
-      </w:r>
-      <w:hyperlink r:id="rId62">
-        <w:r>
-          <w:rPr>
-            <w:u w:val="single"/>
-          </w:rPr>
-          <w:t>Disability Resources and Educational Services</w:t>
-        </w:r>
-      </w:hyperlink>
-      <w:r>
-        <w:rPr>
-          <w:b w:val="0"/>
-          <w:i w:val="0"/>
-        </w:rPr>
-        <w:t xml:space="preserve">. </w:t>
+        <w:t>Recording and sharing.</w:t>
+      </w:r>
+      <w:r>
+        <w:rPr>
+          <w:b w:val="0"/>
+          <w:i w:val="0"/>
+        </w:rPr>
+        <w:t xml:space="preserve"> </w:t>
       </w:r>
       <w:r>
         <w:rPr>
@@ -4988,130 +4877,7 @@
           <w:b w:val="0"/>
           <w:i w:val="0"/>
         </w:rPr>
-        <w:t xml:space="preserve"> Insert the current approved accommodations statement and check that readings, documents, maps, and activities have accessible alternatives.</w:t>
-      </w:r>
-    </w:p>
-    <w:p>
-      <w:r>
-        <w:rPr>
-          <w:b/>
-          <w:i w:val="0"/>
-        </w:rPr>
-        <w:t>Recording and sharing.</w:t>
-      </w:r>
-      <w:r>
-        <w:rPr>
-          <w:b w:val="0"/>
-          <w:i w:val="0"/>
-        </w:rPr>
-        <w:t xml:space="preserve"> </w:t>
-      </w:r>
-      <w:r>
-        <w:rPr>
-          <w:b/>
-          <w:i w:val="0"/>
-          <w:highlight w:val="yellow"/>
-        </w:rPr>
-        <w:t>[TO CONFIRM]</w:t>
-      </w:r>
-      <w:r>
-        <w:rPr>
-          <w:b w:val="0"/>
-          <w:i w:val="0"/>
-        </w:rPr>
         <w:t xml:space="preserve"> Whether seminars will be recorded, the consent and access arrangements, and retention. Do not assume that a class recording or peer document may be shared outside the course.</w:t>
-      </w:r>
-    </w:p>
-    <w:p>
-      <w:r>
-        <w:rPr>
-          <w:b/>
-          <w:i w:val="0"/>
-        </w:rPr>
-        <w:t>Academic integrity.</w:t>
-      </w:r>
-      <w:r>
-        <w:rPr>
-          <w:b w:val="0"/>
-          <w:i w:val="0"/>
-        </w:rPr>
-        <w:t xml:space="preserve"> The </w:t>
-      </w:r>
-      <w:hyperlink r:id="rId63">
-        <w:r>
-          <w:rPr>
-            <w:u w:val="single"/>
-          </w:rPr>
-          <w:t>University Student Code academic-integrity provisions</w:t>
-        </w:r>
-      </w:hyperlink>
-      <w:r>
-        <w:rPr>
-          <w:b w:val="0"/>
-          <w:i w:val="0"/>
-        </w:rPr>
-        <w:t xml:space="preserve"> apply alongside the course's AI-use instructions. </w:t>
-      </w:r>
-      <w:r>
-        <w:rPr>
-          <w:b/>
-          <w:i w:val="0"/>
-          <w:highlight w:val="yellow"/>
-        </w:rPr>
-        <w:t>[TO CONFIRM]</w:t>
-      </w:r>
-      <w:r>
-        <w:rPr>
-          <w:b w:val="0"/>
-          <w:i w:val="0"/>
-        </w:rPr>
-        <w:t xml:space="preserve"> Current required institutional wording and procedures.</w:t>
-      </w:r>
-    </w:p>
-    <w:p>
-      <w:r>
-        <w:rPr>
-          <w:b/>
-          <w:i w:val="0"/>
-        </w:rPr>
-        <w:t>Student support.</w:t>
-      </w:r>
-      <w:r>
-        <w:rPr>
-          <w:b w:val="0"/>
-          <w:i w:val="0"/>
-        </w:rPr>
-        <w:t xml:space="preserve"> Support information is available through the </w:t>
-      </w:r>
-      <w:hyperlink r:id="rId64">
-        <w:r>
-          <w:rPr>
-            <w:u w:val="single"/>
-          </w:rPr>
-          <w:t>Counseling Center</w:t>
-        </w:r>
-      </w:hyperlink>
-      <w:r>
-        <w:rPr>
-          <w:b w:val="0"/>
-          <w:i w:val="0"/>
-        </w:rPr>
-        <w:t xml:space="preserve">. </w:t>
-      </w:r>
-      <w:r>
-        <w:rPr>
-          <w:b/>
-          <w:i w:val="0"/>
-          <w:highlight w:val="yellow"/>
-        </w:rPr>
-        <w:t>[TO CONFIRM]</w:t>
-      </w:r>
-      <w:r>
-        <w:rPr>
-          <w:b w:val="0"/>
-          <w:i w:val="0"/>
-        </w:rPr>
-        <w:t xml:space="preserve"> Add current College and University syllabus statements and links.</w:t>
       </w:r>
     </w:p>
     <w:p>
@@ -6848,7 +6614,7 @@
           <w:b w:val="0"/>
           <w:i w:val="0"/>
         </w:rPr>
-        <w:t>[ ] Final literature review due Tuesday 15 December 2026 at 11:59 PM Central.</w:t>
+        <w:t>[x] Final literature review due Tuesday 15 December 2026 at 11:59 PM Central.</w:t>
       </w:r>
     </w:p>
     <w:p>
@@ -6860,7 +6626,7 @@
           <w:b w:val="0"/>
           <w:i w:val="0"/>
         </w:rPr>
-        <w:t>[ ] Set lengths, source expectations, submission formats, and task rubrics.</w:t>
+        <w:t>[x] Set lengths, source expectations, submission formats, and task rubrics (Task 7 rubric drafted for review).</w:t>
       </w:r>
     </w:p>
     <w:p>
@@ -6872,7 +6638,7 @@
           <w:b w:val="0"/>
           <w:i w:val="0"/>
         </w:rPr>
-        <w:t>[ ] Choose readings and update AI examples before each seminar.</w:t>
+        <w:t>[ ] Choose readings for Sessions 5–7 and a replacement research-question guide.</w:t>
       </w:r>
     </w:p>
     <w:p>
@@ -6884,7 +6650,7 @@
           <w:b w:val="0"/>
           <w:i w:val="0"/>
         </w:rPr>
-        <w:t>[ ] Confirm the feedback schedule and peer-work alternatives.</w:t>
+        <w:t>[x] Confirm the feedback schedule and peer-work alternatives.</w:t>
       </w:r>
     </w:p>
     <w:p>
@@ -6896,7 +6662,7 @@
           <w:b w:val="0"/>
           <w:i w:val="0"/>
         </w:rPr>
-        <w:t>[ ] Create fresh collaborative documents and check student access.</w:t>
+        <w:t>[x] Create fresh collaborative documents (EPOL 590 Fall 2026 Google Doc). Check student access.</w:t>
       </w:r>
     </w:p>
     <w:p>
@@ -6908,7 +6674,7 @@
           <w:b w:val="0"/>
           <w:i w:val="0"/>
         </w:rPr>
-        <w:t>[ ] Complete the grading, AI, accessibility, recording, and support policies.</w:t>
+        <w:t>[ ] Decide late work, recording and the grading-scale rounding rule. (AI, accessibility and support statements done.)</w:t>
       </w:r>
     </w:p>
     <w:p>
@@ -6920,7 +6686,7 @@
           <w:b w:val="0"/>
           <w:i w:val="0"/>
         </w:rPr>
-        <w:t>[ ] Create Canvas assignments with weights and dates totaling 100%.</w:t>
+        <w:t>[x] Create Canvas assignments with weights and dates totaling 100%.</w:t>
       </w:r>
     </w:p>
     <w:p>
@@ -6939,7 +6705,7 @@
         </w:rPr>
         <w:t xml:space="preserve">Structure adapted from </w:t>
       </w:r>
-      <w:hyperlink r:id="rId65">
+      <w:hyperlink r:id="rId62">
         <w:r>
           <w:rPr>
             <w:u w:val="single"/>
@@ -6954,7 +6720,7 @@
         </w:rPr>
         <w:t xml:space="preserve">. Course content and starting weights come from the </w:t>
       </w:r>
-      <w:hyperlink r:id="rId66">
+      <w:hyperlink r:id="rId63">
         <w:r>
           <w:rPr>
             <w:u w:val="single"/>
@@ -6978,7 +6744,7 @@
         </w:rPr>
         <w:t xml:space="preserve">Official calendar anchors: </w:t>
       </w:r>
-      <w:hyperlink r:id="rId67">
+      <w:hyperlink r:id="rId64">
         <w:r>
           <w:rPr>
             <w:u w:val="single"/>

</xml_diff>

<commit_message>
590 syllabus: lenient late-work policy (no penalty, 48-hour grace, final cutoff 18 Dec)
Co-Authored-By: Claude Opus 5.5 <noreply@anthropic.com>
</commit_message>
<xml_diff>
--- a/courses/590-fall-2026/syllabus/University-of-Illinois-Urbana-Champaign-Syllabus-590-Fall-2026-Draft.docx
+++ b/courses/590-fall-2026/syllabus/University-of-Illinois-Urbana-Champaign-Syllabus-590-Fall-2026-Draft.docx
@@ -4817,36 +4817,21 @@
           <w:b w:val="0"/>
           <w:i w:val="0"/>
         </w:rPr>
-        <w:t xml:space="preserve"> Contact me early if a deadline creates a problem. Staged tasks support later work, so an extension should include a realistic plan for catching up. </w:t>
+        <w:t xml:space="preserve"> There is no late penalty. Every task has an automatic 48-hour grace period: submit within 48 hours of the deadline and you do not need to ask or explain. If you need longer, email me before the grace period ends with a short plan for catching up; the staged tasks build on each other, so the plan matters more than the reason. The final cutoff for all work, including Task 7, is </w:t>
       </w:r>
       <w:r>
         <w:rPr>
           <w:b/>
           <w:i w:val="0"/>
-          <w:highlight w:val="yellow"/>
-        </w:rPr>
-        <w:t>[TO CONFIRM]</w:t>
-      </w:r>
-      <w:r>
-        <w:rPr>
-          <w:b w:val="0"/>
-          <w:i w:val="0"/>
-        </w:rPr>
-        <w:t xml:space="preserve"> Any penalties, extension procedure, and the final submission cutoff. The Registrar lists the faculty grade-reporting deadline as </w:t>
-      </w:r>
-      <w:r>
-        <w:rPr>
-          <w:b/>
-          <w:i w:val="0"/>
-        </w:rPr>
-        <w:t>22 December 2026 at 2:00 PM</w:t>
-      </w:r>
-      <w:r>
-        <w:rPr>
-          <w:b w:val="0"/>
-          <w:i w:val="0"/>
-        </w:rPr>
-        <w:t>; this is an instructor deadline, not a student submission date.</w:t>
+        </w:rPr>
+        <w:t>Friday 18 December 2026 at 11:59 PM Central</w:t>
+      </w:r>
+      <w:r>
+        <w:rPr>
+          <w:b w:val="0"/>
+          <w:i w:val="0"/>
+        </w:rPr>
+        <w:t>; nothing can be accepted after that, because grades are due to the Registrar on 22 December.</w:t>
       </w:r>
     </w:p>
     <w:p>
@@ -6674,7 +6659,7 @@
           <w:b w:val="0"/>
           <w:i w:val="0"/>
         </w:rPr>
-        <w:t>[ ] Decide late work, recording and the grading-scale rounding rule. (AI, accessibility and support statements done.)</w:t>
+        <w:t>[ ] Decide recording and the grading-scale rounding rule. (Late work, AI, accessibility and support statements done.)</w:t>
       </w:r>
     </w:p>
     <w:p>

</xml_diff>

<commit_message>
590 syllabus: grading, rounding, recording; keep Word edits
- Grading scale: letter grades from the weighted components; standard
  rounding (one decimal, boundary values earn the higher grade)
- Recording: Zoom recordings posted on Canvas weekly, breakouts not
  recorded, options for not appearing, course-only use
- Ported the instructor's Word edits back into syllabus.md: draft banner
  sentence removed; Sessions 5-7 readings determined by individual projects
- No [TO CONFIRM] markers remain

Co-Authored-By: Claude Opus 5.5 <noreply@anthropic.com>
</commit_message>
<xml_diff>
--- a/courses/590-fall-2026/syllabus/University-of-Illinois-Urbana-Champaign-Syllabus-590-Fall-2026-Draft.docx
+++ b/courses/590-fall-2026/syllabus/University-of-Illinois-Urbana-Champaign-Syllabus-590-Fall-2026-Draft.docx
@@ -54,22 +54,7 @@
           <w:b w:val="0"/>
           <w:i w:val="0"/>
         </w:rPr>
-        <w:t xml:space="preserve"> The final literature review is due Tuesday 15 December 2026 at 11:59 PM Central. Other course arrangements and assignment dates remain ready for revision. Items marked </w:t>
-      </w:r>
-      <w:r>
-        <w:rPr>
-          <w:b/>
-          <w:i w:val="0"/>
-          <w:highlight w:val="yellow"/>
-        </w:rPr>
-        <w:t>[TO CONFIRM]</w:t>
-      </w:r>
-      <w:r>
-        <w:rPr>
-          <w:b w:val="0"/>
-          <w:i w:val="0"/>
-        </w:rPr>
-        <w:t xml:space="preserve"> need completion before release to students.</w:t>
+        <w:t xml:space="preserve"> The final literature review is due Tuesday 15 December 2026 at 11:59 PM Central. Other course arrangements and assignment dates remain ready for revision.</w:t>
       </w:r>
     </w:p>
     <w:tbl>
@@ -1384,18 +1369,10 @@
     <w:p>
       <w:r>
         <w:rPr>
-          <w:b/>
-          <w:i w:val="0"/>
-          <w:highlight w:val="yellow"/>
-        </w:rPr>
-        <w:t>[TO CONFIRM]</w:t>
-      </w:r>
-      <w:r>
-        <w:rPr>
-          <w:b w:val="0"/>
-          <w:i w:val="0"/>
-        </w:rPr>
-        <w:t xml:space="preserve"> A sociology-of-knowledge reading for Session 5, a reflection reading for Session 6, and a case on automation for Session 7.</w:t>
+          <w:b w:val="0"/>
+          <w:i w:val="0"/>
+        </w:rPr>
+        <w:t>Readings determined by individual projects, to support literature drafting and final assignment.</w:t>
       </w:r>
     </w:p>
     <w:p>
@@ -3772,22 +3749,7 @@
           <w:b w:val="0"/>
           <w:i w:val="0"/>
         </w:rPr>
-        <w:t xml:space="preserve">The scale below is retained from the 479 syllabus as a draft starting point. </w:t>
-      </w:r>
-      <w:r>
-        <w:rPr>
-          <w:b/>
-          <w:i w:val="0"/>
-          <w:highlight w:val="yellow"/>
-        </w:rPr>
-        <w:t>[TO CONFIRM]</w:t>
-      </w:r>
-      <w:r>
-        <w:rPr>
-          <w:b w:val="0"/>
-          <w:i w:val="0"/>
-        </w:rPr>
-        <w:t xml:space="preserve"> Final course and program grading arrangements.</w:t>
+        <w:t>Final course grades are letter grades on the scale below, calculated from the weighted assessment components above.</w:t>
       </w:r>
     </w:p>
     <w:tbl>
@@ -4751,18 +4713,10 @@
     <w:p>
       <w:r>
         <w:rPr>
-          <w:b/>
-          <w:i w:val="0"/>
-          <w:highlight w:val="yellow"/>
-        </w:rPr>
-        <w:t>[TO CONFIRM]</w:t>
-      </w:r>
-      <w:r>
-        <w:rPr>
-          <w:b w:val="0"/>
-          <w:i w:val="0"/>
-        </w:rPr>
-        <w:t xml:space="preserve"> Rounding rule, treatment of fractional boundary values, and whether this scale is appropriate for the enrolled sections.</w:t>
+          <w:b w:val="0"/>
+          <w:i w:val="0"/>
+        </w:rPr>
+        <w:t>The final percentage is rounded to one decimal place, and a percentage at or above a boundary earns the higher grade: for example, 89.95 rounds to 90.0, an A−. Boundaries will not be raised; I may lower them if that benefits the class.</w:t>
       </w:r>
     </w:p>
     <w:p>
@@ -4847,22 +4801,7 @@
           <w:b w:val="0"/>
           <w:i w:val="0"/>
         </w:rPr>
-        <w:t xml:space="preserve"> </w:t>
-      </w:r>
-      <w:r>
-        <w:rPr>
-          <w:b/>
-          <w:i w:val="0"/>
-          <w:highlight w:val="yellow"/>
-        </w:rPr>
-        <w:t>[TO CONFIRM]</w:t>
-      </w:r>
-      <w:r>
-        <w:rPr>
-          <w:b w:val="0"/>
-          <w:i w:val="0"/>
-        </w:rPr>
-        <w:t xml:space="preserve"> Whether seminars will be recorded, the consent and access arrangements, and retention. Do not assume that a class recording or peer document may be shared outside the course.</w:t>
+        <w:t xml:space="preserve"> Seminars are recorded on Zoom, and links to the recordings are posted on Canvas each week, so you can review a session or catch up on one you missed. Breakout rooms are not recorded. If you would rather not appear in a recording, keep your camera off, change your display name, or contribute through the chat. Recordings and the class Google Doc are for students enrolled in this course only: do not download, share or post them outside the course, and do not make your own recordings of seminars without asking me first.</w:t>
       </w:r>
     </w:p>
     <w:p>
@@ -6623,7 +6562,7 @@
           <w:b w:val="0"/>
           <w:i w:val="0"/>
         </w:rPr>
-        <w:t>[ ] Choose readings for Sessions 5–7 and a replacement research-question guide.</w:t>
+        <w:t>[ ] Replace the research-question guide (Minnesota link is dead).</w:t>
       </w:r>
     </w:p>
     <w:p>
@@ -6659,7 +6598,7 @@
           <w:b w:val="0"/>
           <w:i w:val="0"/>
         </w:rPr>
-        <w:t>[ ] Decide recording and the grading-scale rounding rule. (Late work, AI, accessibility and support statements done.)</w:t>
+        <w:t>[x] Grading, late work, recording, AI, accessibility and support policies.</w:t>
       </w:r>
     </w:p>
     <w:p>

</xml_diff>